<commit_message>
Commit 2 movimiento completo del jugador
En este commit agregue varias funciones para que nuestro jugador pudiese moverse similar a lo que hacen en garrys Mod porque me gusta ese juego y tiene un movimiento bastante bueno. Puede agacharse, saltar, correr, moverse con teclado y raton a la vez, y puedes en el script de mover controlar los valores del jugador para adaptarlos mejor.
</commit_message>
<xml_diff>
--- a/Game Design Document/GDD_COMA Elliot Kenneth Villafaña Pasten.docx
+++ b/Game Design Document/GDD_COMA Elliot Kenneth Villafaña Pasten.docx
@@ -257,7 +257,30 @@
             <w14:bevel/>
           </w14:textOutline>
         </w:rPr>
-        <w:t xml:space="preserve"> 1.0</w:t>
+        <w:t xml:space="preserve"> 1.</w:t>
+      </w:r>
+      <w:r>
+        <w:rPr>
+          <w:rFonts w:ascii="Times New Roman" w:hAnsi="Times New Roman" w:cs="Times New Roman"/>
+          <w:color w:val="000000" w:themeColor="text1"/>
+          <w:sz w:val="44"/>
+          <w:szCs w:val="44"/>
+          <w:u w:val="single"/>
+          <w:lang w:val="es-MX"/>
+          <w14:shadow w14:blurRad="50800" w14:dist="38100" w14:dir="0" w14:sx="100000" w14:sy="100000" w14:kx="0" w14:ky="0" w14:algn="l">
+            <w14:srgbClr w14:val="000000">
+              <w14:alpha w14:val="60000"/>
+            </w14:srgbClr>
+          </w14:shadow>
+          <w14:textOutline w14:w="12700" w14:cap="rnd" w14:cmpd="sng" w14:algn="ctr">
+            <w14:solidFill>
+              <w14:srgbClr w14:val="7030A0"/>
+            </w14:solidFill>
+            <w14:prstDash w14:val="solid"/>
+            <w14:bevel/>
+          </w14:textOutline>
+        </w:rPr>
+        <w:t>1</w:t>
       </w:r>
     </w:p>
     <w:p>
@@ -468,7 +491,44 @@
           <w:rFonts w:ascii="DePixel" w:hAnsi="DePixel"/>
           <w:lang w:val="es-MX"/>
         </w:rPr>
-        <w:t xml:space="preserve"> es un juego de terror en primera persona con enfoque cooperativo y de extracción, donde el equipo entra a un laboratorio abandonado para recuperar objetos valiosos y contener/extraer criaturas creadas como experimentos de guerra.</w:t>
+        <w:t xml:space="preserve"> es un juego de terror en primera persona con enfoque cooperativo y de extracción, donde </w:t>
+      </w:r>
+      <w:r>
+        <w:rPr>
+          <w:rFonts w:ascii="DePixel" w:hAnsi="DePixel"/>
+          <w:lang w:val="es-MX"/>
+        </w:rPr>
+        <w:t>un</w:t>
+      </w:r>
+      <w:r>
+        <w:rPr>
+          <w:rFonts w:ascii="DePixel" w:hAnsi="DePixel"/>
+          <w:lang w:val="es-MX"/>
+        </w:rPr>
+        <w:t xml:space="preserve"> equipo</w:t>
+      </w:r>
+      <w:r>
+        <w:rPr>
+          <w:rFonts w:ascii="DePixel" w:hAnsi="DePixel"/>
+          <w:lang w:val="es-MX"/>
+        </w:rPr>
+        <w:t xml:space="preserve"> pequeño de jóvenes exploradores urbanos, entran a unas viejas instalaciones donde se utilizaban para la guerra, para conseguir material para su canal de YT. De pronto les pica la curiosidad al encontrarse una </w:t>
+      </w:r>
+      <w:proofErr w:type="spellStart"/>
+      <w:r>
+        <w:rPr>
+          <w:rFonts w:ascii="DePixel" w:hAnsi="DePixel"/>
+          <w:lang w:val="es-MX"/>
+        </w:rPr>
+        <w:t>maquina</w:t>
+      </w:r>
+      <w:proofErr w:type="spellEnd"/>
+      <w:r>
+        <w:rPr>
+          <w:rFonts w:ascii="DePixel" w:hAnsi="DePixel"/>
+          <w:lang w:val="es-MX"/>
+        </w:rPr>
+        <w:t xml:space="preserve"> virtual que se volvió famosa en documentales una vez termino la tercera guerra mundial. Y estos entran dentro de su sistema, sin percatarse que alguien los estaba esperando.  </w:t>
       </w:r>
     </w:p>
     <w:p>
@@ -516,7 +576,14 @@
           <w:rFonts w:ascii="DePixel" w:hAnsi="DePixel"/>
           <w:lang w:val="es-MX"/>
         </w:rPr>
-        <w:t>PC como lanzamiento inicial; consolas/crossplay solo como fase posterior si el proyecto escala y el MVP está sólido.</w:t>
+        <w:t>PC como lanzamiento inicial</w:t>
+      </w:r>
+      <w:r>
+        <w:rPr>
+          <w:rFonts w:ascii="DePixel" w:hAnsi="DePixel"/>
+          <w:lang w:val="es-MX"/>
+        </w:rPr>
+        <w:t>.</w:t>
       </w:r>
     </w:p>
     <w:p>
@@ -615,7 +682,16 @@
           <w:bCs/>
           <w:lang w:val="es-MX"/>
         </w:rPr>
-        <w:t xml:space="preserve">Tensión cooperativa: </w:t>
+        <w:t>Tensión cooperativa:</w:t>
+      </w:r>
+      <w:r>
+        <w:rPr>
+          <w:rFonts w:ascii="DePixel" w:hAnsi="DePixel"/>
+          <w:b/>
+          <w:bCs/>
+          <w:lang w:val="es-MX"/>
+        </w:rPr>
+        <w:t xml:space="preserve"> </w:t>
       </w:r>
       <w:r>
         <w:rPr>
@@ -960,7 +1036,7 @@
           <w:rFonts w:ascii="DePixel" w:hAnsi="DePixel"/>
           <w:lang w:val="es-MX"/>
         </w:rPr>
-        <w:t>, mejorar traje/equipo, desbloquear opciones.</w:t>
+        <w:t>, mejorar traje, desbloquear opciones.</w:t>
       </w:r>
     </w:p>
     <w:p>
@@ -1069,7 +1145,16 @@
           <w:bCs/>
           <w:lang w:val="es-MX"/>
         </w:rPr>
-        <w:t>1 mapa del laboratorio con 3 zonas conectadas.</w:t>
+        <w:t xml:space="preserve">1 mapa del </w:t>
+      </w:r>
+      <w:r>
+        <w:rPr>
+          <w:rFonts w:ascii="DePixel" w:hAnsi="DePixel"/>
+          <w:b/>
+          <w:bCs/>
+          <w:lang w:val="es-MX"/>
+        </w:rPr>
+        <w:t>laboratorio.</w:t>
       </w:r>
     </w:p>
     <w:p>
@@ -1089,7 +1174,16 @@
           <w:bCs/>
           <w:lang w:val="es-MX"/>
         </w:rPr>
-        <w:t>3 criaturas con comportamientos distintos (patrulla, acecho, reacción a ruido/luz).</w:t>
+        <w:t>3 criaturas con comportamientos distintos</w:t>
+      </w:r>
+      <w:r>
+        <w:rPr>
+          <w:rFonts w:ascii="DePixel" w:hAnsi="DePixel"/>
+          <w:b/>
+          <w:bCs/>
+          <w:lang w:val="es-MX"/>
+        </w:rPr>
+        <w:t xml:space="preserve">: </w:t>
       </w:r>
     </w:p>
     <w:p>
@@ -1109,7 +1203,7 @@
           <w:bCs/>
           <w:lang w:val="es-MX"/>
         </w:rPr>
-        <w:t xml:space="preserve">10 objetos de </w:t>
+        <w:t xml:space="preserve">Patrulla: Este enemigo tiene la capacidad de perseguirte por todo el mapa sin dejarte un respiro, solo puede rastrearte si es que </w:t>
       </w:r>
       <w:proofErr w:type="spellStart"/>
       <w:r>
@@ -1119,7 +1213,7 @@
           <w:bCs/>
           <w:lang w:val="es-MX"/>
         </w:rPr>
-        <w:t>loot</w:t>
+        <w:t>el</w:t>
       </w:r>
       <w:proofErr w:type="spellEnd"/>
       <w:r>
@@ -1129,7 +1223,27 @@
           <w:bCs/>
           <w:lang w:val="es-MX"/>
         </w:rPr>
-        <w:t xml:space="preserve"> (materiales/artefactos) con valor.</w:t>
+        <w:t xml:space="preserve"> te ve claramente, y sin importar donde estes </w:t>
+      </w:r>
+      <w:proofErr w:type="spellStart"/>
+      <w:r>
+        <w:rPr>
+          <w:rFonts w:ascii="DePixel" w:hAnsi="DePixel"/>
+          <w:b/>
+          <w:bCs/>
+          <w:lang w:val="es-MX"/>
+        </w:rPr>
+        <w:t>el</w:t>
+      </w:r>
+      <w:proofErr w:type="spellEnd"/>
+      <w:r>
+        <w:rPr>
+          <w:rFonts w:ascii="DePixel" w:hAnsi="DePixel"/>
+          <w:b/>
+          <w:bCs/>
+          <w:lang w:val="es-MX"/>
+        </w:rPr>
+        <w:t xml:space="preserve"> te encontrara.</w:t>
       </w:r>
     </w:p>
     <w:p>
@@ -1149,7 +1263,7 @@
           <w:bCs/>
           <w:lang w:val="es-MX"/>
         </w:rPr>
-        <w:t>3 herramientas de contención/defensa (ej. trampa, aturdidor, contenedor).</w:t>
+        <w:t>Acecho: Este enemigo estará constantemente recopilando pistas de tu paradero desde que pongas un pie encima del laboratorio, y podrá seguirte desde la oscuridad o cuando menos prevenido estes, pero será lento.</w:t>
       </w:r>
     </w:p>
     <w:p>
@@ -1169,28 +1283,864 @@
           <w:bCs/>
           <w:lang w:val="es-MX"/>
         </w:rPr>
-        <w:t>1 sistema de extracción + tienda simple para comprar/mejorar equipo.</w:t>
+        <w:t xml:space="preserve">Ruido y luz: Sera muy sensible al ruido, al punto de que será casi como su sentido dominante, y podrá escucharte muy bien si es que no guardas muy bien silencio, al igual que el ruido la luz le será muy sensible, y entre </w:t>
+      </w:r>
+      <w:proofErr w:type="spellStart"/>
+      <w:r>
+        <w:rPr>
+          <w:rFonts w:ascii="DePixel" w:hAnsi="DePixel"/>
+          <w:b/>
+          <w:bCs/>
+          <w:lang w:val="es-MX"/>
+        </w:rPr>
+        <w:t>mas</w:t>
+      </w:r>
+      <w:proofErr w:type="spellEnd"/>
+      <w:r>
+        <w:rPr>
+          <w:rFonts w:ascii="DePixel" w:hAnsi="DePixel"/>
+          <w:b/>
+          <w:bCs/>
+          <w:lang w:val="es-MX"/>
+        </w:rPr>
+        <w:t xml:space="preserve"> haya luz </w:t>
+      </w:r>
+      <w:proofErr w:type="spellStart"/>
+      <w:r>
+        <w:rPr>
+          <w:rFonts w:ascii="DePixel" w:hAnsi="DePixel"/>
+          <w:b/>
+          <w:bCs/>
+          <w:lang w:val="es-MX"/>
+        </w:rPr>
+        <w:t>mas</w:t>
+      </w:r>
+      <w:proofErr w:type="spellEnd"/>
+      <w:r>
+        <w:rPr>
+          <w:rFonts w:ascii="DePixel" w:hAnsi="DePixel"/>
+          <w:b/>
+          <w:bCs/>
+          <w:lang w:val="es-MX"/>
+        </w:rPr>
+        <w:t xml:space="preserve"> rápido se vuelve.  </w:t>
+      </w:r>
+      <w:r>
+        <w:rPr>
+          <w:rFonts w:ascii="DePixel" w:hAnsi="DePixel"/>
+          <w:b/>
+          <w:bCs/>
+          <w:lang w:val="es-MX"/>
+        </w:rPr>
+        <w:t xml:space="preserve"> </w:t>
       </w:r>
     </w:p>
     <w:p>
       <w:pPr>
         <w:pStyle w:val="Listaconvietas"/>
-        <w:rPr>
-          <w:rFonts w:ascii="DePixel" w:hAnsi="DePixel"/>
-          <w:b/>
-          <w:bCs/>
-          <w:lang w:val="es-MX"/>
-        </w:rPr>
-      </w:pPr>
-      <w:r>
-        <w:rPr>
-          <w:rFonts w:ascii="DePixel" w:hAnsi="DePixel"/>
-          <w:b/>
-          <w:bCs/>
-          <w:lang w:val="es-MX"/>
-        </w:rPr>
-        <w:t>UI mínima (inventario simple, objetivos y estado del equipo).</w:t>
-      </w:r>
+        <w:numPr>
+          <w:ilvl w:val="0"/>
+          <w:numId w:val="0"/>
+        </w:numPr>
+        <w:ind w:left="360"/>
+        <w:rPr>
+          <w:rFonts w:ascii="DePixel" w:hAnsi="DePixel"/>
+          <w:b/>
+          <w:bCs/>
+          <w:lang w:val="es-MX"/>
+        </w:rPr>
+      </w:pPr>
+    </w:p>
+    <w:p>
+      <w:pPr>
+        <w:pStyle w:val="Listaconvietas"/>
+        <w:numPr>
+          <w:ilvl w:val="0"/>
+          <w:numId w:val="0"/>
+        </w:numPr>
+        <w:ind w:left="360"/>
+        <w:rPr>
+          <w:rFonts w:ascii="DePixel" w:hAnsi="DePixel"/>
+          <w:b/>
+          <w:bCs/>
+          <w:lang w:val="es-MX"/>
+        </w:rPr>
+      </w:pPr>
+    </w:p>
+    <w:p>
+      <w:pPr>
+        <w:pStyle w:val="Listaconvietas"/>
+        <w:rPr>
+          <w:rFonts w:ascii="DePixel" w:hAnsi="DePixel"/>
+          <w:b/>
+          <w:bCs/>
+          <w:lang w:val="es-MX"/>
+        </w:rPr>
+      </w:pPr>
+      <w:r>
+        <w:rPr>
+          <w:rFonts w:ascii="DePixel" w:hAnsi="DePixel"/>
+          <w:b/>
+          <w:bCs/>
+          <w:lang w:val="es-MX"/>
+        </w:rPr>
+        <w:t xml:space="preserve">10 objetos de </w:t>
+      </w:r>
+      <w:proofErr w:type="spellStart"/>
+      <w:r>
+        <w:rPr>
+          <w:rFonts w:ascii="DePixel" w:hAnsi="DePixel"/>
+          <w:b/>
+          <w:bCs/>
+          <w:lang w:val="es-MX"/>
+        </w:rPr>
+        <w:t>loot</w:t>
+      </w:r>
+      <w:proofErr w:type="spellEnd"/>
+      <w:r>
+        <w:rPr>
+          <w:rFonts w:ascii="DePixel" w:hAnsi="DePixel"/>
+          <w:b/>
+          <w:bCs/>
+          <w:lang w:val="es-MX"/>
+        </w:rPr>
+        <w:t xml:space="preserve"> (materiales/artefactos) con valor</w:t>
+      </w:r>
+      <w:r>
+        <w:rPr>
+          <w:rFonts w:ascii="DePixel" w:hAnsi="DePixel"/>
+          <w:b/>
+          <w:bCs/>
+          <w:lang w:val="es-MX"/>
+        </w:rPr>
+        <w:t>:</w:t>
+      </w:r>
+    </w:p>
+    <w:p>
+      <w:pPr>
+        <w:pStyle w:val="Listaconvietas"/>
+        <w:numPr>
+          <w:ilvl w:val="0"/>
+          <w:numId w:val="0"/>
+        </w:numPr>
+        <w:ind w:left="360"/>
+        <w:rPr>
+          <w:rFonts w:ascii="DePixel" w:hAnsi="DePixel"/>
+          <w:b/>
+          <w:bCs/>
+          <w:lang w:val="es-MX"/>
+        </w:rPr>
+      </w:pPr>
+      <w:r>
+        <w:rPr>
+          <w:rFonts w:ascii="DePixel" w:hAnsi="DePixel"/>
+          <w:b/>
+          <w:bCs/>
+          <w:lang w:val="es-MX"/>
+        </w:rPr>
+        <w:t xml:space="preserve">-Entre ellos el </w:t>
+      </w:r>
+      <w:proofErr w:type="spellStart"/>
+      <w:r>
+        <w:rPr>
+          <w:rFonts w:ascii="DePixel" w:hAnsi="DePixel"/>
+          <w:b/>
+          <w:bCs/>
+          <w:lang w:val="es-MX"/>
+        </w:rPr>
+        <w:t>loot</w:t>
+      </w:r>
+      <w:proofErr w:type="spellEnd"/>
+      <w:r>
+        <w:rPr>
+          <w:rFonts w:ascii="DePixel" w:hAnsi="DePixel"/>
+          <w:b/>
+          <w:bCs/>
+          <w:lang w:val="es-MX"/>
+        </w:rPr>
+        <w:t xml:space="preserve"> se </w:t>
+      </w:r>
+      <w:proofErr w:type="gramStart"/>
+      <w:r>
+        <w:rPr>
+          <w:rFonts w:ascii="DePixel" w:hAnsi="DePixel"/>
+          <w:b/>
+          <w:bCs/>
+          <w:lang w:val="es-MX"/>
+        </w:rPr>
+        <w:t>clasificara</w:t>
+      </w:r>
+      <w:proofErr w:type="gramEnd"/>
+      <w:r>
+        <w:rPr>
+          <w:rFonts w:ascii="DePixel" w:hAnsi="DePixel"/>
+          <w:b/>
+          <w:bCs/>
+          <w:lang w:val="es-MX"/>
+        </w:rPr>
+        <w:t xml:space="preserve"> por su valor desde el traje, y dependiendo del tamaño será pequeño, mediano o grande su peso. </w:t>
+      </w:r>
+    </w:p>
+    <w:p>
+      <w:pPr>
+        <w:pStyle w:val="Listaconvietas"/>
+        <w:rPr>
+          <w:rFonts w:ascii="DePixel" w:hAnsi="DePixel"/>
+          <w:b/>
+          <w:bCs/>
+          <w:lang w:val="es-MX"/>
+        </w:rPr>
+      </w:pPr>
+      <w:r>
+        <w:rPr>
+          <w:rFonts w:ascii="DePixel" w:hAnsi="DePixel"/>
+          <w:b/>
+          <w:bCs/>
+          <w:lang w:val="es-MX"/>
+        </w:rPr>
+        <w:t>4</w:t>
+      </w:r>
+      <w:r>
+        <w:rPr>
+          <w:rFonts w:ascii="DePixel" w:hAnsi="DePixel"/>
+          <w:b/>
+          <w:bCs/>
+          <w:lang w:val="es-MX"/>
+        </w:rPr>
+        <w:t xml:space="preserve"> herramientas de contención/defensa (trampa, aturdidor, contenedor</w:t>
+      </w:r>
+      <w:r>
+        <w:rPr>
+          <w:rFonts w:ascii="DePixel" w:hAnsi="DePixel"/>
+          <w:b/>
+          <w:bCs/>
+          <w:lang w:val="es-MX"/>
+        </w:rPr>
+        <w:t>, armas</w:t>
+      </w:r>
+      <w:r>
+        <w:rPr>
+          <w:rFonts w:ascii="DePixel" w:hAnsi="DePixel"/>
+          <w:b/>
+          <w:bCs/>
+          <w:lang w:val="es-MX"/>
+        </w:rPr>
+        <w:t>).</w:t>
+      </w:r>
+    </w:p>
+    <w:p>
+      <w:pPr>
+        <w:pStyle w:val="Listaconvietas"/>
+        <w:numPr>
+          <w:ilvl w:val="0"/>
+          <w:numId w:val="0"/>
+        </w:numPr>
+        <w:ind w:left="360"/>
+        <w:rPr>
+          <w:rFonts w:ascii="DePixel" w:hAnsi="DePixel"/>
+          <w:b/>
+          <w:bCs/>
+          <w:lang w:val="es-MX"/>
+        </w:rPr>
+      </w:pPr>
+      <w:r>
+        <w:rPr>
+          <w:rFonts w:ascii="DePixel" w:hAnsi="DePixel"/>
+          <w:b/>
+          <w:bCs/>
+          <w:lang w:val="es-MX"/>
+        </w:rPr>
+        <w:t xml:space="preserve">-La trampa te </w:t>
+      </w:r>
+      <w:proofErr w:type="spellStart"/>
+      <w:r>
+        <w:rPr>
+          <w:rFonts w:ascii="DePixel" w:hAnsi="DePixel"/>
+          <w:b/>
+          <w:bCs/>
+          <w:lang w:val="es-MX"/>
+        </w:rPr>
+        <w:t>dira</w:t>
+      </w:r>
+      <w:proofErr w:type="spellEnd"/>
+      <w:r>
+        <w:rPr>
+          <w:rFonts w:ascii="DePixel" w:hAnsi="DePixel"/>
+          <w:b/>
+          <w:bCs/>
+          <w:lang w:val="es-MX"/>
+        </w:rPr>
+        <w:t xml:space="preserve"> exactamente </w:t>
+      </w:r>
+      <w:proofErr w:type="spellStart"/>
+      <w:r>
+        <w:rPr>
+          <w:rFonts w:ascii="DePixel" w:hAnsi="DePixel"/>
+          <w:b/>
+          <w:bCs/>
+          <w:lang w:val="es-MX"/>
+        </w:rPr>
+        <w:t>cuando</w:t>
+      </w:r>
+      <w:proofErr w:type="spellEnd"/>
+      <w:r>
+        <w:rPr>
+          <w:rFonts w:ascii="DePixel" w:hAnsi="DePixel"/>
+          <w:b/>
+          <w:bCs/>
+          <w:lang w:val="es-MX"/>
+        </w:rPr>
+        <w:t xml:space="preserve"> paso el enemigo, y </w:t>
+      </w:r>
+      <w:proofErr w:type="gramStart"/>
+      <w:r>
+        <w:rPr>
+          <w:rFonts w:ascii="DePixel" w:hAnsi="DePixel"/>
+          <w:b/>
+          <w:bCs/>
+          <w:lang w:val="es-MX"/>
+        </w:rPr>
+        <w:t>explotara</w:t>
+      </w:r>
+      <w:proofErr w:type="gramEnd"/>
+      <w:r>
+        <w:rPr>
+          <w:rFonts w:ascii="DePixel" w:hAnsi="DePixel"/>
+          <w:b/>
+          <w:bCs/>
+          <w:lang w:val="es-MX"/>
+        </w:rPr>
+        <w:t xml:space="preserve"> (en dado caso que </w:t>
+      </w:r>
+      <w:proofErr w:type="gramStart"/>
+      <w:r>
+        <w:rPr>
+          <w:rFonts w:ascii="DePixel" w:hAnsi="DePixel"/>
+          <w:b/>
+          <w:bCs/>
+          <w:lang w:val="es-MX"/>
+        </w:rPr>
+        <w:t>tu pases</w:t>
+      </w:r>
+      <w:proofErr w:type="gramEnd"/>
+      <w:r>
+        <w:rPr>
+          <w:rFonts w:ascii="DePixel" w:hAnsi="DePixel"/>
+          <w:b/>
+          <w:bCs/>
+          <w:lang w:val="es-MX"/>
+        </w:rPr>
+        <w:t xml:space="preserve"> encima de la trampa, también te hará daño).</w:t>
+      </w:r>
+    </w:p>
+    <w:p>
+      <w:pPr>
+        <w:pStyle w:val="Listaconvietas"/>
+        <w:numPr>
+          <w:ilvl w:val="0"/>
+          <w:numId w:val="0"/>
+        </w:numPr>
+        <w:ind w:left="360"/>
+        <w:rPr>
+          <w:rFonts w:ascii="DePixel" w:hAnsi="DePixel"/>
+          <w:b/>
+          <w:bCs/>
+          <w:lang w:val="es-MX"/>
+        </w:rPr>
+      </w:pPr>
+      <w:r>
+        <w:rPr>
+          <w:rFonts w:ascii="DePixel" w:hAnsi="DePixel"/>
+          <w:b/>
+          <w:bCs/>
+          <w:lang w:val="es-MX"/>
+        </w:rPr>
+        <w:t xml:space="preserve">-Aturdidor, esta arma aturde al enemigo por unos 6 segundos en la misma posición y </w:t>
+      </w:r>
+      <w:r>
+        <w:rPr>
+          <w:rFonts w:ascii="DePixel" w:hAnsi="DePixel"/>
+          <w:b/>
+          <w:bCs/>
+          <w:lang w:val="es-MX"/>
+        </w:rPr>
+        <w:t xml:space="preserve">una vez que pasen esos 6 segundos se alentara el enemigo por 5 segundos para que puedas escapar. </w:t>
+      </w:r>
+    </w:p>
+    <w:p>
+      <w:pPr>
+        <w:pStyle w:val="Listaconvietas"/>
+        <w:numPr>
+          <w:ilvl w:val="0"/>
+          <w:numId w:val="0"/>
+        </w:numPr>
+        <w:ind w:left="360"/>
+        <w:rPr>
+          <w:rFonts w:ascii="DePixel" w:hAnsi="DePixel"/>
+          <w:b/>
+          <w:bCs/>
+          <w:lang w:val="es-MX"/>
+        </w:rPr>
+      </w:pPr>
+      <w:r>
+        <w:rPr>
+          <w:rFonts w:ascii="DePixel" w:hAnsi="DePixel"/>
+          <w:b/>
+          <w:bCs/>
+          <w:lang w:val="es-MX"/>
+        </w:rPr>
+        <w:t>-Contenedor: Este te permite capturar al enemigo</w:t>
+      </w:r>
+      <w:r>
+        <w:rPr>
+          <w:rFonts w:ascii="DePixel" w:hAnsi="DePixel"/>
+          <w:b/>
+          <w:bCs/>
+          <w:lang w:val="es-MX"/>
+        </w:rPr>
+        <w:t xml:space="preserve"> estando vivo o muerto (cuando </w:t>
+      </w:r>
+      <w:proofErr w:type="spellStart"/>
+      <w:r>
+        <w:rPr>
+          <w:rFonts w:ascii="DePixel" w:hAnsi="DePixel"/>
+          <w:b/>
+          <w:bCs/>
+          <w:lang w:val="es-MX"/>
+        </w:rPr>
+        <w:t>este</w:t>
+      </w:r>
+      <w:proofErr w:type="spellEnd"/>
+      <w:r>
+        <w:rPr>
+          <w:rFonts w:ascii="DePixel" w:hAnsi="DePixel"/>
+          <w:b/>
+          <w:bCs/>
+          <w:lang w:val="es-MX"/>
+        </w:rPr>
+        <w:t xml:space="preserve"> vivo será </w:t>
+      </w:r>
+      <w:proofErr w:type="spellStart"/>
+      <w:r>
+        <w:rPr>
+          <w:rFonts w:ascii="DePixel" w:hAnsi="DePixel"/>
+          <w:b/>
+          <w:bCs/>
+          <w:lang w:val="es-MX"/>
+        </w:rPr>
+        <w:t>mas</w:t>
+      </w:r>
+      <w:proofErr w:type="spellEnd"/>
+      <w:r>
+        <w:rPr>
+          <w:rFonts w:ascii="DePixel" w:hAnsi="DePixel"/>
+          <w:b/>
+          <w:bCs/>
+          <w:lang w:val="es-MX"/>
+        </w:rPr>
+        <w:t xml:space="preserve"> difícil capturarlo porque tiene </w:t>
+      </w:r>
+      <w:proofErr w:type="spellStart"/>
+      <w:r>
+        <w:rPr>
+          <w:rFonts w:ascii="DePixel" w:hAnsi="DePixel"/>
+          <w:b/>
+          <w:bCs/>
+          <w:lang w:val="es-MX"/>
+        </w:rPr>
+        <w:t>mas</w:t>
+      </w:r>
+      <w:proofErr w:type="spellEnd"/>
+      <w:r>
+        <w:rPr>
+          <w:rFonts w:ascii="DePixel" w:hAnsi="DePixel"/>
+          <w:b/>
+          <w:bCs/>
+          <w:lang w:val="es-MX"/>
+        </w:rPr>
+        <w:t xml:space="preserve"> probabilidades de salir), (si </w:t>
+      </w:r>
+      <w:proofErr w:type="spellStart"/>
+      <w:r>
+        <w:rPr>
+          <w:rFonts w:ascii="DePixel" w:hAnsi="DePixel"/>
+          <w:b/>
+          <w:bCs/>
+          <w:lang w:val="es-MX"/>
+        </w:rPr>
+        <w:t>esta</w:t>
+      </w:r>
+      <w:proofErr w:type="spellEnd"/>
+      <w:r>
+        <w:rPr>
+          <w:rFonts w:ascii="DePixel" w:hAnsi="DePixel"/>
+          <w:b/>
+          <w:bCs/>
+          <w:lang w:val="es-MX"/>
+        </w:rPr>
+        <w:t xml:space="preserve"> muerto es 100% seguro que lo capturaras).</w:t>
+      </w:r>
+    </w:p>
+    <w:p>
+      <w:pPr>
+        <w:pStyle w:val="Listaconvietas"/>
+        <w:numPr>
+          <w:ilvl w:val="0"/>
+          <w:numId w:val="0"/>
+        </w:numPr>
+        <w:ind w:left="360"/>
+        <w:rPr>
+          <w:rFonts w:ascii="DePixel" w:hAnsi="DePixel"/>
+          <w:b/>
+          <w:bCs/>
+          <w:lang w:val="es-MX"/>
+        </w:rPr>
+      </w:pPr>
+      <w:r>
+        <w:rPr>
+          <w:rFonts w:ascii="DePixel" w:hAnsi="DePixel"/>
+          <w:b/>
+          <w:bCs/>
+          <w:lang w:val="es-MX"/>
+        </w:rPr>
+        <w:t>-Armas: Co</w:t>
+      </w:r>
+      <w:r>
+        <w:rPr>
+          <w:rFonts w:ascii="DePixel" w:hAnsi="DePixel"/>
+          <w:b/>
+          <w:bCs/>
+          <w:lang w:val="es-MX"/>
+        </w:rPr>
+        <w:t xml:space="preserve">mo cualquier arma, podrás disparar y recargar, y harás daño a los enemigos, dependiendo de que armas tengas disponibles, será </w:t>
+      </w:r>
+      <w:proofErr w:type="spellStart"/>
+      <w:r>
+        <w:rPr>
+          <w:rFonts w:ascii="DePixel" w:hAnsi="DePixel"/>
+          <w:b/>
+          <w:bCs/>
+          <w:lang w:val="es-MX"/>
+        </w:rPr>
+        <w:t>mas</w:t>
+      </w:r>
+      <w:proofErr w:type="spellEnd"/>
+      <w:r>
+        <w:rPr>
+          <w:rFonts w:ascii="DePixel" w:hAnsi="DePixel"/>
+          <w:b/>
+          <w:bCs/>
+          <w:lang w:val="es-MX"/>
+        </w:rPr>
+        <w:t xml:space="preserve"> difícil o fácil acabar con las amenazas.  </w:t>
+      </w:r>
+      <w:r>
+        <w:rPr>
+          <w:rFonts w:ascii="DePixel" w:hAnsi="DePixel"/>
+          <w:b/>
+          <w:bCs/>
+          <w:lang w:val="es-MX"/>
+        </w:rPr>
+        <w:t xml:space="preserve">  </w:t>
+      </w:r>
+      <w:r>
+        <w:rPr>
+          <w:rFonts w:ascii="DePixel" w:hAnsi="DePixel"/>
+          <w:b/>
+          <w:bCs/>
+          <w:lang w:val="es-MX"/>
+        </w:rPr>
+        <w:t xml:space="preserve"> </w:t>
+      </w:r>
+    </w:p>
+    <w:p>
+      <w:pPr>
+        <w:pStyle w:val="Listaconvietas"/>
+        <w:rPr>
+          <w:rFonts w:ascii="DePixel" w:hAnsi="DePixel"/>
+          <w:b/>
+          <w:bCs/>
+          <w:lang w:val="es-MX"/>
+        </w:rPr>
+      </w:pPr>
+      <w:r>
+        <w:rPr>
+          <w:rFonts w:ascii="DePixel" w:hAnsi="DePixel"/>
+          <w:b/>
+          <w:bCs/>
+          <w:lang w:val="es-MX"/>
+        </w:rPr>
+        <w:t>1 sistema de extracción + tienda simple para comprar/mejorar equipo.</w:t>
+      </w:r>
+    </w:p>
+    <w:p>
+      <w:pPr>
+        <w:pStyle w:val="Listaconvietas"/>
+        <w:rPr>
+          <w:rFonts w:ascii="DePixel" w:hAnsi="DePixel"/>
+          <w:b/>
+          <w:bCs/>
+          <w:lang w:val="es-MX"/>
+        </w:rPr>
+      </w:pPr>
+      <w:r>
+        <w:rPr>
+          <w:rFonts w:ascii="DePixel" w:hAnsi="DePixel"/>
+          <w:b/>
+          <w:bCs/>
+          <w:lang w:val="es-MX"/>
+        </w:rPr>
+        <w:lastRenderedPageBreak/>
+        <w:t>UI mínima</w:t>
+      </w:r>
+      <w:r>
+        <w:rPr>
+          <w:rFonts w:ascii="DePixel" w:hAnsi="DePixel"/>
+          <w:b/>
+          <w:bCs/>
+          <w:lang w:val="es-MX"/>
+        </w:rPr>
+        <w:t>:</w:t>
+      </w:r>
+    </w:p>
+    <w:p>
+      <w:pPr>
+        <w:pStyle w:val="Listaconvietas"/>
+        <w:numPr>
+          <w:ilvl w:val="0"/>
+          <w:numId w:val="0"/>
+        </w:numPr>
+        <w:ind w:left="360"/>
+        <w:rPr>
+          <w:rFonts w:ascii="DePixel" w:hAnsi="DePixel"/>
+          <w:b/>
+          <w:bCs/>
+          <w:lang w:val="es-MX"/>
+        </w:rPr>
+      </w:pPr>
+      <w:r>
+        <w:rPr>
+          <w:rFonts w:ascii="DePixel" w:hAnsi="DePixel"/>
+          <w:b/>
+          <w:bCs/>
+          <w:lang w:val="es-MX"/>
+        </w:rPr>
+        <w:t>-</w:t>
+      </w:r>
+      <w:r>
+        <w:rPr>
+          <w:rFonts w:ascii="DePixel" w:hAnsi="DePixel"/>
+          <w:b/>
+          <w:bCs/>
+          <w:lang w:val="es-MX"/>
+        </w:rPr>
+        <w:t>inventario simple</w:t>
+      </w:r>
+      <w:r>
+        <w:rPr>
+          <w:rFonts w:ascii="DePixel" w:hAnsi="DePixel"/>
+          <w:b/>
+          <w:bCs/>
+          <w:lang w:val="es-MX"/>
+        </w:rPr>
+        <w:t xml:space="preserve">: </w:t>
+      </w:r>
+      <w:proofErr w:type="spellStart"/>
+      <w:r>
+        <w:rPr>
+          <w:rFonts w:ascii="DePixel" w:hAnsi="DePixel"/>
+          <w:b/>
+          <w:bCs/>
+          <w:lang w:val="es-MX"/>
+        </w:rPr>
+        <w:t>Podras</w:t>
+      </w:r>
+      <w:proofErr w:type="spellEnd"/>
+      <w:r>
+        <w:rPr>
+          <w:rFonts w:ascii="DePixel" w:hAnsi="DePixel"/>
+          <w:b/>
+          <w:bCs/>
+          <w:lang w:val="es-MX"/>
+        </w:rPr>
+        <w:t xml:space="preserve"> ver tu inventario actual rápido al momento, y podrás acceder a ella con</w:t>
+      </w:r>
+      <w:r>
+        <w:rPr>
+          <w:rFonts w:ascii="DePixel" w:hAnsi="DePixel"/>
+          <w:b/>
+          <w:bCs/>
+          <w:lang w:val="es-MX"/>
+        </w:rPr>
+        <w:t xml:space="preserve"> “TAB” para verlo a detalle. </w:t>
+      </w:r>
+    </w:p>
+    <w:p>
+      <w:pPr>
+        <w:pStyle w:val="Listaconvietas"/>
+        <w:numPr>
+          <w:ilvl w:val="0"/>
+          <w:numId w:val="0"/>
+        </w:numPr>
+        <w:ind w:left="360"/>
+        <w:rPr>
+          <w:rFonts w:ascii="DePixel" w:hAnsi="DePixel"/>
+          <w:b/>
+          <w:bCs/>
+          <w:lang w:val="es-MX"/>
+        </w:rPr>
+      </w:pPr>
+      <w:r>
+        <w:rPr>
+          <w:rFonts w:ascii="DePixel" w:hAnsi="DePixel"/>
+          <w:b/>
+          <w:bCs/>
+          <w:lang w:val="es-MX"/>
+        </w:rPr>
+        <w:t>-</w:t>
+      </w:r>
+      <w:r>
+        <w:rPr>
+          <w:rFonts w:ascii="DePixel" w:hAnsi="DePixel"/>
+          <w:b/>
+          <w:bCs/>
+          <w:lang w:val="es-MX"/>
+        </w:rPr>
+        <w:t>Objetivos</w:t>
+      </w:r>
+      <w:r>
+        <w:rPr>
+          <w:rFonts w:ascii="DePixel" w:hAnsi="DePixel"/>
+          <w:b/>
+          <w:bCs/>
+          <w:lang w:val="es-MX"/>
+        </w:rPr>
+        <w:t xml:space="preserve">: El jugador desde el traje vera los objetivos del mapa si es que se pierde y no logra avanzar. </w:t>
+      </w:r>
+    </w:p>
+    <w:p>
+      <w:pPr>
+        <w:pStyle w:val="Listaconvietas"/>
+        <w:numPr>
+          <w:ilvl w:val="0"/>
+          <w:numId w:val="0"/>
+        </w:numPr>
+        <w:ind w:left="360"/>
+        <w:rPr>
+          <w:rFonts w:ascii="DePixel" w:hAnsi="DePixel"/>
+          <w:b/>
+          <w:bCs/>
+          <w:lang w:val="es-MX"/>
+        </w:rPr>
+      </w:pPr>
+    </w:p>
+    <w:p>
+      <w:pPr>
+        <w:pStyle w:val="Listaconvietas"/>
+        <w:numPr>
+          <w:ilvl w:val="0"/>
+          <w:numId w:val="0"/>
+        </w:numPr>
+        <w:ind w:left="360"/>
+        <w:rPr>
+          <w:rFonts w:ascii="DePixel" w:hAnsi="DePixel"/>
+          <w:b/>
+          <w:bCs/>
+          <w:lang w:val="es-MX"/>
+        </w:rPr>
+      </w:pPr>
+      <w:r>
+        <w:rPr>
+          <w:rFonts w:ascii="DePixel" w:hAnsi="DePixel"/>
+          <w:b/>
+          <w:bCs/>
+          <w:lang w:val="es-MX"/>
+        </w:rPr>
+        <w:t xml:space="preserve"> </w:t>
+      </w:r>
+      <w:r>
+        <w:rPr>
+          <w:rFonts w:ascii="DePixel" w:hAnsi="DePixel"/>
+          <w:b/>
+          <w:bCs/>
+          <w:lang w:val="es-MX"/>
+        </w:rPr>
+        <w:t>-</w:t>
+      </w:r>
+      <w:r>
+        <w:rPr>
+          <w:rFonts w:ascii="DePixel" w:hAnsi="DePixel"/>
+          <w:b/>
+          <w:bCs/>
+          <w:lang w:val="es-MX"/>
+        </w:rPr>
+        <w:t>y estado del equipo</w:t>
+      </w:r>
+      <w:r>
+        <w:rPr>
+          <w:rFonts w:ascii="DePixel" w:hAnsi="DePixel"/>
+          <w:b/>
+          <w:bCs/>
+          <w:lang w:val="es-MX"/>
+        </w:rPr>
+        <w:t xml:space="preserve">: </w:t>
+      </w:r>
+      <w:r>
+        <w:rPr>
+          <w:rFonts w:ascii="DePixel" w:hAnsi="DePixel"/>
+          <w:b/>
+          <w:bCs/>
+          <w:lang w:val="es-MX"/>
+        </w:rPr>
+        <w:t>Estará</w:t>
+      </w:r>
+      <w:r>
+        <w:rPr>
+          <w:rFonts w:ascii="DePixel" w:hAnsi="DePixel"/>
+          <w:b/>
+          <w:bCs/>
+          <w:lang w:val="es-MX"/>
+        </w:rPr>
+        <w:t xml:space="preserve"> situado en la esquina inferior izquierda, donde veras el estado de salud del jugador, la estamina, la munición del arma como su arma o el objeto que portes a la mano, y con </w:t>
+      </w:r>
+      <w:proofErr w:type="spellStart"/>
+      <w:proofErr w:type="gramStart"/>
+      <w:r>
+        <w:rPr>
+          <w:rFonts w:ascii="DePixel" w:hAnsi="DePixel"/>
+          <w:b/>
+          <w:bCs/>
+          <w:lang w:val="es-MX"/>
+        </w:rPr>
+        <w:t>click</w:t>
+      </w:r>
+      <w:proofErr w:type="spellEnd"/>
+      <w:proofErr w:type="gramEnd"/>
+      <w:r>
+        <w:rPr>
+          <w:rFonts w:ascii="DePixel" w:hAnsi="DePixel"/>
+          <w:b/>
+          <w:bCs/>
+          <w:lang w:val="es-MX"/>
+        </w:rPr>
+        <w:t xml:space="preserve"> derecho veras el estado de los objetos escaneándolos en un radio de 4-5 metros.</w:t>
+      </w:r>
+    </w:p>
+    <w:p>
+      <w:pPr>
+        <w:pStyle w:val="Listaconvietas"/>
+        <w:numPr>
+          <w:ilvl w:val="0"/>
+          <w:numId w:val="0"/>
+        </w:numPr>
+        <w:ind w:left="360"/>
+        <w:rPr>
+          <w:rFonts w:ascii="DePixel" w:hAnsi="DePixel"/>
+          <w:b/>
+          <w:bCs/>
+          <w:lang w:val="es-MX"/>
+        </w:rPr>
+      </w:pPr>
     </w:p>
     <w:p>
       <w:pPr>
@@ -1252,7 +2202,51 @@
           <w:rFonts w:ascii="DePixel" w:hAnsi="DePixel"/>
           <w:lang w:val="es-MX"/>
         </w:rPr>
-        <w:t xml:space="preserve"> que sea lanzado en modo multijugador, aunque primero haremos las pruebas haciéndolo offline. Trata de que tu como jugador serás enviado a una zona totalmente destruida por la guerra y contaminado por tantos acontecimientos históricos para contener objetos valiosos y principalmente estas enviado allí para contener y extraer criaturas que son experimentos creados para la guerra.</w:t>
+        <w:t xml:space="preserve"> que sea lanzado en modo multijugador, aunque primero haremos las pruebas haciéndolo offline. Trata de que tu como jugador serás enviado a una zona totalmente</w:t>
+      </w:r>
+      <w:r>
+        <w:rPr>
+          <w:rFonts w:ascii="DePixel" w:hAnsi="DePixel"/>
+          <w:lang w:val="es-MX"/>
+        </w:rPr>
+        <w:t xml:space="preserve"> virtual donde entrenaban soldados para mejorar sus habilidades, sin embargo, tarde o temprano encontraras la verdad de que hay alguien allí acechando</w:t>
+      </w:r>
+      <w:r>
+        <w:rPr>
+          <w:rFonts w:ascii="DePixel" w:hAnsi="DePixel"/>
+          <w:lang w:val="es-MX"/>
+        </w:rPr>
+        <w:t xml:space="preserve">, acechándote sus creaciones que mejoro con el tiempo con </w:t>
+      </w:r>
+      <w:proofErr w:type="spellStart"/>
+      <w:r>
+        <w:rPr>
+          <w:rFonts w:ascii="DePixel" w:hAnsi="DePixel"/>
+          <w:lang w:val="es-MX"/>
+        </w:rPr>
+        <w:t>codigo</w:t>
+      </w:r>
+      <w:proofErr w:type="spellEnd"/>
+      <w:r>
+        <w:rPr>
+          <w:rFonts w:ascii="DePixel" w:hAnsi="DePixel"/>
+          <w:lang w:val="es-MX"/>
+        </w:rPr>
+        <w:t xml:space="preserve">, </w:t>
+      </w:r>
+      <w:r>
+        <w:rPr>
+          <w:rFonts w:ascii="DePixel" w:hAnsi="DePixel"/>
+          <w:lang w:val="es-MX"/>
+        </w:rPr>
+        <w:t>que espero mucho tiempo y que está dispuesto a lo peor para llevar tu cascaron al mundo real</w:t>
+      </w:r>
+      <w:r>
+        <w:rPr>
+          <w:rFonts w:ascii="DePixel" w:hAnsi="DePixel"/>
+          <w:lang w:val="es-MX"/>
+        </w:rPr>
+        <w:t>.</w:t>
       </w:r>
     </w:p>
     <w:p>
@@ -1471,7 +2465,7 @@
           <w:rFonts w:ascii="DePixel" w:hAnsi="DePixel"/>
           <w:lang w:val="es-MX"/>
         </w:rPr>
-        <w:t xml:space="preserve">ara PC de entrada y si tiene éxito, para consolas y que ambos modos consola y pc puedan hacer crossplay (solo si tiene éxito). </w:t>
+        <w:t xml:space="preserve">ara PC de entrada </w:t>
       </w:r>
     </w:p>
     <w:p>
@@ -1583,6 +2577,7 @@
             <w14:bevel/>
           </w14:textOutline>
         </w:rPr>
+        <w:lastRenderedPageBreak/>
         <w:t>6. Motor y herramientas</w:t>
       </w:r>
     </w:p>
@@ -1632,7 +2627,6 @@
             <w14:bevel/>
           </w14:textOutline>
         </w:rPr>
-        <w:lastRenderedPageBreak/>
         <w:t>7. Mec</w:t>
       </w:r>
       <w:r>
@@ -1776,7 +2770,25 @@
           <w:szCs w:val="20"/>
           <w:lang w:val="es-MX"/>
         </w:rPr>
-        <w:t xml:space="preserve">Llevará el jugador un traje en todo momento para la extracción de diferentes materiales esta mecánica hace que el jugador pueda abrir puertas, abrir contenedores, destruir, abollar zonas del mapa que tengan materiales, cosas como cables, generadores, herramienta abandonada, placas de video, básicamente chatarra de los restos del laboratorio, también esta mecánica del traje te permitirá mejorar tu equipamiento, como fabricar armas para la contención de los experimentos que rondan por el lugar. O simplemente puedes venderlos fuera de la extracción, y comprar equipo ya fabricado a un alto costo. </w:t>
+        <w:t>Llevará el jugador un traje en todo momento para la extracción de diferentes materiales esta mecánica hace que el jugador pueda abrir puertas, abrir contenedores, destruir, abollar zonas del mapa que tengan materiales</w:t>
+      </w:r>
+      <w:r>
+        <w:rPr>
+          <w:rFonts w:ascii="DePixel" w:hAnsi="DePixel"/>
+          <w:sz w:val="20"/>
+          <w:szCs w:val="20"/>
+          <w:lang w:val="es-MX"/>
+        </w:rPr>
+        <w:t xml:space="preserve"> duros</w:t>
+      </w:r>
+      <w:r>
+        <w:rPr>
+          <w:rFonts w:ascii="DePixel" w:hAnsi="DePixel"/>
+          <w:sz w:val="20"/>
+          <w:szCs w:val="20"/>
+          <w:lang w:val="es-MX"/>
+        </w:rPr>
+        <w:t xml:space="preserve">, cosas como cables, generadores, herramienta abandonada, placas de video, básicamente chatarra de los restos del laboratorio, también esta mecánica del traje te permitirá mejorar tu equipamiento, como fabricar armas para la contención de los experimentos que rondan por el lugar. O simplemente puedes venderlos fuera de la extracción, y comprar equipo ya fabricado a un alto costo. </w:t>
       </w:r>
     </w:p>
     <w:p>
@@ -2048,8 +3060,25 @@
             <w14:bevel/>
           </w14:textOutline>
         </w:rPr>
-        <w:t xml:space="preserve"> target</w:t>
-      </w:r>
+        <w:t xml:space="preserve"> </w:t>
+      </w:r>
+      <w:proofErr w:type="gramStart"/>
+      <w:r>
+        <w:rPr>
+          <w:rFonts w:ascii="Pixel" w:hAnsi="Pixel"/>
+          <w:color w:val="000000" w:themeColor="text1"/>
+          <w:lang w:val="es-MX"/>
+          <w14:textOutline w14:w="9525" w14:cap="rnd" w14:cmpd="sng" w14:algn="ctr">
+            <w14:solidFill>
+              <w14:srgbClr w14:val="92D050"/>
+            </w14:solidFill>
+            <w14:prstDash w14:val="solid"/>
+            <w14:bevel/>
+          </w14:textOutline>
+        </w:rPr>
+        <w:t>target</w:t>
+      </w:r>
+      <w:proofErr w:type="gramEnd"/>
     </w:p>
     <w:p>
       <w:pPr>
@@ -2122,32 +3151,32 @@
       </w:pPr>
       <w:r>
         <w:rPr>
-          <w:rFonts w:ascii="DePixel" w:hAnsi="DePixel"/>
-          <w:sz w:val="20"/>
-          <w:szCs w:val="20"/>
-          <w:lang w:val="es-MX"/>
-        </w:rPr>
-        <w:t xml:space="preserve">9.- Jugadores jugables: </w:t>
-      </w:r>
-      <w:proofErr w:type="spellStart"/>
-      <w:r>
-        <w:rPr>
-          <w:rFonts w:ascii="DePixel" w:hAnsi="DePixel"/>
-          <w:sz w:val="20"/>
-          <w:szCs w:val="20"/>
-          <w:lang w:val="es-MX"/>
-        </w:rPr>
-        <w:t>Maximo</w:t>
-      </w:r>
-      <w:proofErr w:type="spellEnd"/>
-      <w:r>
-        <w:rPr>
-          <w:rFonts w:ascii="DePixel" w:hAnsi="DePixel"/>
-          <w:sz w:val="20"/>
-          <w:szCs w:val="20"/>
-          <w:lang w:val="es-MX"/>
-        </w:rPr>
-        <w:t xml:space="preserve"> de 4 personas por partida (por el momento será solo una)</w:t>
+          <w:rFonts w:ascii="Pixel" w:eastAsiaTheme="majorEastAsia" w:hAnsi="Pixel" w:cstheme="majorBidi"/>
+          <w:b/>
+          <w:bCs/>
+          <w:color w:val="000000" w:themeColor="text1"/>
+          <w:sz w:val="28"/>
+          <w:szCs w:val="28"/>
+          <w:lang w:val="es-MX"/>
+          <w14:textOutline w14:w="9525" w14:cap="rnd" w14:cmpd="sng" w14:algn="ctr">
+            <w14:solidFill>
+              <w14:srgbClr w14:val="92D050"/>
+            </w14:solidFill>
+            <w14:prstDash w14:val="solid"/>
+            <w14:bevel/>
+          </w14:textOutline>
+        </w:rPr>
+        <w:lastRenderedPageBreak/>
+        <w:t>9.- Jugadores jugables:</w:t>
+      </w:r>
+      <w:r>
+        <w:rPr>
+          <w:rFonts w:ascii="DePixel" w:hAnsi="DePixel"/>
+          <w:sz w:val="20"/>
+          <w:szCs w:val="20"/>
+          <w:lang w:val="es-MX"/>
+        </w:rPr>
+        <w:t xml:space="preserve"> </w:t>
       </w:r>
     </w:p>
     <w:p>
@@ -2165,15 +3194,6 @@
           <w:lang w:val="es-MX"/>
         </w:rPr>
       </w:pPr>
-      <w:r>
-        <w:rPr>
-          <w:rFonts w:ascii="DePixel" w:hAnsi="DePixel"/>
-          <w:sz w:val="20"/>
-          <w:szCs w:val="20"/>
-          <w:lang w:val="es-MX"/>
-        </w:rPr>
-        <w:t>-Jugadores no jugables (</w:t>
-      </w:r>
       <w:proofErr w:type="spellStart"/>
       <w:r>
         <w:rPr>
@@ -2182,7 +3202,7 @@
           <w:szCs w:val="20"/>
           <w:lang w:val="es-MX"/>
         </w:rPr>
-        <w:t>NPCs</w:t>
+        <w:t>Maximo</w:t>
       </w:r>
       <w:proofErr w:type="spellEnd"/>
       <w:r>
@@ -2192,27 +3212,7 @@
           <w:szCs w:val="20"/>
           <w:lang w:val="es-MX"/>
         </w:rPr>
-        <w:t xml:space="preserve">): enemigos o </w:t>
-      </w:r>
-      <w:proofErr w:type="spellStart"/>
-      <w:r>
-        <w:rPr>
-          <w:rFonts w:ascii="DePixel" w:hAnsi="DePixel"/>
-          <w:sz w:val="20"/>
-          <w:szCs w:val="20"/>
-          <w:lang w:val="es-MX"/>
-        </w:rPr>
-        <w:t>NPCs</w:t>
-      </w:r>
-      <w:proofErr w:type="spellEnd"/>
-      <w:r>
-        <w:rPr>
-          <w:rFonts w:ascii="DePixel" w:hAnsi="DePixel"/>
-          <w:sz w:val="20"/>
-          <w:szCs w:val="20"/>
-          <w:lang w:val="es-MX"/>
-        </w:rPr>
-        <w:t xml:space="preserve"> decorativos.</w:t>
+        <w:t xml:space="preserve"> de 4 personas por partida (por el momento será solo una)</w:t>
       </w:r>
     </w:p>
     <w:p>
@@ -2230,6 +3230,55 @@
           <w:lang w:val="es-MX"/>
         </w:rPr>
       </w:pPr>
+      <w:r>
+        <w:rPr>
+          <w:rFonts w:ascii="DePixel" w:hAnsi="DePixel"/>
+          <w:sz w:val="20"/>
+          <w:szCs w:val="20"/>
+          <w:lang w:val="es-MX"/>
+        </w:rPr>
+        <w:t>-Jugadores no jugables (</w:t>
+      </w:r>
+      <w:proofErr w:type="spellStart"/>
+      <w:r>
+        <w:rPr>
+          <w:rFonts w:ascii="DePixel" w:hAnsi="DePixel"/>
+          <w:sz w:val="20"/>
+          <w:szCs w:val="20"/>
+          <w:lang w:val="es-MX"/>
+        </w:rPr>
+        <w:t>NPCs</w:t>
+      </w:r>
+      <w:proofErr w:type="spellEnd"/>
+      <w:r>
+        <w:rPr>
+          <w:rFonts w:ascii="DePixel" w:hAnsi="DePixel"/>
+          <w:sz w:val="20"/>
+          <w:szCs w:val="20"/>
+          <w:lang w:val="es-MX"/>
+        </w:rPr>
+        <w:t xml:space="preserve">): enemigos o </w:t>
+      </w:r>
+      <w:proofErr w:type="spellStart"/>
+      <w:r>
+        <w:rPr>
+          <w:rFonts w:ascii="DePixel" w:hAnsi="DePixel"/>
+          <w:sz w:val="20"/>
+          <w:szCs w:val="20"/>
+          <w:lang w:val="es-MX"/>
+        </w:rPr>
+        <w:t>NPCs</w:t>
+      </w:r>
+      <w:proofErr w:type="spellEnd"/>
+      <w:r>
+        <w:rPr>
+          <w:rFonts w:ascii="DePixel" w:hAnsi="DePixel"/>
+          <w:sz w:val="20"/>
+          <w:szCs w:val="20"/>
+          <w:lang w:val="es-MX"/>
+        </w:rPr>
+        <w:t xml:space="preserve"> decorativos.</w:t>
+      </w:r>
     </w:p>
     <w:p>
       <w:pPr>
@@ -2262,65 +3311,6 @@
           <w:lang w:val="es-MX"/>
         </w:rPr>
       </w:pPr>
-      <w:r>
-        <w:rPr>
-          <w:rFonts w:ascii="DePixel" w:hAnsi="DePixel"/>
-          <w:sz w:val="20"/>
-          <w:szCs w:val="20"/>
-          <w:lang w:val="es-MX"/>
-        </w:rPr>
-        <w:lastRenderedPageBreak/>
-        <w:t xml:space="preserve">10.- Diseño del personaje: Low </w:t>
-      </w:r>
-      <w:proofErr w:type="spellStart"/>
-      <w:r>
-        <w:rPr>
-          <w:rFonts w:ascii="DePixel" w:hAnsi="DePixel"/>
-          <w:sz w:val="20"/>
-          <w:szCs w:val="20"/>
-          <w:lang w:val="es-MX"/>
-        </w:rPr>
-        <w:t>poly</w:t>
-      </w:r>
-      <w:proofErr w:type="spellEnd"/>
-      <w:r>
-        <w:rPr>
-          <w:rFonts w:ascii="DePixel" w:hAnsi="DePixel"/>
-          <w:sz w:val="20"/>
-          <w:szCs w:val="20"/>
-          <w:lang w:val="es-MX"/>
-        </w:rPr>
-        <w:t xml:space="preserve">, </w:t>
-      </w:r>
-      <w:proofErr w:type="spellStart"/>
-      <w:r>
-        <w:rPr>
-          <w:rFonts w:ascii="DePixel" w:hAnsi="DePixel"/>
-          <w:sz w:val="20"/>
-          <w:szCs w:val="20"/>
-          <w:lang w:val="es-MX"/>
-        </w:rPr>
-        <w:t>chibi</w:t>
-      </w:r>
-      <w:proofErr w:type="spellEnd"/>
-      <w:r>
-        <w:rPr>
-          <w:rFonts w:ascii="DePixel" w:hAnsi="DePixel"/>
-          <w:sz w:val="20"/>
-          <w:szCs w:val="20"/>
-          <w:lang w:val="es-MX"/>
-        </w:rPr>
-        <w:t xml:space="preserve"> y con</w:t>
-      </w:r>
-      <w:r>
-        <w:rPr>
-          <w:rFonts w:ascii="DePixel" w:hAnsi="DePixel"/>
-          <w:sz w:val="20"/>
-          <w:szCs w:val="20"/>
-          <w:lang w:val="es-MX"/>
-        </w:rPr>
-        <w:t xml:space="preserve"> traje futurista:</w:t>
-      </w:r>
     </w:p>
     <w:p>
       <w:pPr>
@@ -2339,12 +3329,161 @@
       </w:pPr>
       <w:r>
         <w:rPr>
-          <w:rFonts w:ascii="DePixel" w:hAnsi="DePixel"/>
-          <w:sz w:val="20"/>
-          <w:szCs w:val="20"/>
-          <w:lang w:val="es-MX"/>
-        </w:rPr>
-        <w:t xml:space="preserve">(FOTO de ejemplo): </w:t>
+          <w:rFonts w:ascii="Pixel" w:eastAsiaTheme="majorEastAsia" w:hAnsi="Pixel" w:cstheme="majorBidi"/>
+          <w:b/>
+          <w:bCs/>
+          <w:color w:val="000000" w:themeColor="text1"/>
+          <w:sz w:val="28"/>
+          <w:szCs w:val="28"/>
+          <w:lang w:val="es-MX"/>
+          <w14:textOutline w14:w="9525" w14:cap="rnd" w14:cmpd="sng" w14:algn="ctr">
+            <w14:solidFill>
+              <w14:srgbClr w14:val="92D050"/>
+            </w14:solidFill>
+            <w14:prstDash w14:val="solid"/>
+            <w14:bevel/>
+          </w14:textOutline>
+        </w:rPr>
+        <w:t>10.- Dise</w:t>
+      </w:r>
+      <w:r>
+        <w:rPr>
+          <w:rFonts w:ascii="Cambria" w:eastAsiaTheme="majorEastAsia" w:hAnsi="Cambria" w:cs="Cambria"/>
+          <w:b/>
+          <w:bCs/>
+          <w:color w:val="000000" w:themeColor="text1"/>
+          <w:sz w:val="28"/>
+          <w:szCs w:val="28"/>
+          <w:lang w:val="es-MX"/>
+          <w14:textOutline w14:w="9525" w14:cap="rnd" w14:cmpd="sng" w14:algn="ctr">
+            <w14:solidFill>
+              <w14:srgbClr w14:val="92D050"/>
+            </w14:solidFill>
+            <w14:prstDash w14:val="solid"/>
+            <w14:bevel/>
+          </w14:textOutline>
+        </w:rPr>
+        <w:t>ñ</w:t>
+      </w:r>
+      <w:r>
+        <w:rPr>
+          <w:rFonts w:ascii="Pixel" w:eastAsiaTheme="majorEastAsia" w:hAnsi="Pixel" w:cstheme="majorBidi"/>
+          <w:b/>
+          <w:bCs/>
+          <w:color w:val="000000" w:themeColor="text1"/>
+          <w:sz w:val="28"/>
+          <w:szCs w:val="28"/>
+          <w:lang w:val="es-MX"/>
+          <w14:textOutline w14:w="9525" w14:cap="rnd" w14:cmpd="sng" w14:algn="ctr">
+            <w14:solidFill>
+              <w14:srgbClr w14:val="92D050"/>
+            </w14:solidFill>
+            <w14:prstDash w14:val="solid"/>
+            <w14:bevel/>
+          </w14:textOutline>
+        </w:rPr>
+        <w:t>o del personaje:</w:t>
+      </w:r>
+      <w:r>
+        <w:rPr>
+          <w:rFonts w:ascii="DePixel" w:hAnsi="DePixel"/>
+          <w:sz w:val="20"/>
+          <w:szCs w:val="20"/>
+          <w:lang w:val="es-MX"/>
+        </w:rPr>
+        <w:t xml:space="preserve"> Low </w:t>
+      </w:r>
+      <w:proofErr w:type="spellStart"/>
+      <w:r>
+        <w:rPr>
+          <w:rFonts w:ascii="DePixel" w:hAnsi="DePixel"/>
+          <w:sz w:val="20"/>
+          <w:szCs w:val="20"/>
+          <w:lang w:val="es-MX"/>
+        </w:rPr>
+        <w:t>poly</w:t>
+      </w:r>
+      <w:proofErr w:type="spellEnd"/>
+      <w:r>
+        <w:rPr>
+          <w:rFonts w:ascii="DePixel" w:hAnsi="DePixel"/>
+          <w:sz w:val="20"/>
+          <w:szCs w:val="20"/>
+          <w:lang w:val="es-MX"/>
+        </w:rPr>
+        <w:t xml:space="preserve">, </w:t>
+      </w:r>
+      <w:proofErr w:type="spellStart"/>
+      <w:r>
+        <w:rPr>
+          <w:rFonts w:ascii="DePixel" w:hAnsi="DePixel"/>
+          <w:sz w:val="20"/>
+          <w:szCs w:val="20"/>
+          <w:lang w:val="es-MX"/>
+        </w:rPr>
+        <w:t>chibi</w:t>
+      </w:r>
+      <w:proofErr w:type="spellEnd"/>
+      <w:r>
+        <w:rPr>
+          <w:rFonts w:ascii="DePixel" w:hAnsi="DePixel"/>
+          <w:sz w:val="20"/>
+          <w:szCs w:val="20"/>
+          <w:lang w:val="es-MX"/>
+        </w:rPr>
+        <w:t xml:space="preserve"> y con</w:t>
+      </w:r>
+      <w:r>
+        <w:rPr>
+          <w:rFonts w:ascii="DePixel" w:hAnsi="DePixel"/>
+          <w:sz w:val="20"/>
+          <w:szCs w:val="20"/>
+          <w:lang w:val="es-MX"/>
+        </w:rPr>
+        <w:t xml:space="preserve"> traje futurista:</w:t>
+      </w:r>
+    </w:p>
+    <w:p>
+      <w:pPr>
+        <w:pStyle w:val="Listaconvietas"/>
+        <w:numPr>
+          <w:ilvl w:val="0"/>
+          <w:numId w:val="0"/>
+        </w:numPr>
+        <w:ind w:left="360" w:hanging="360"/>
+        <w:rPr>
+          <w:rFonts w:ascii="DePixel" w:hAnsi="DePixel"/>
+          <w:sz w:val="20"/>
+          <w:szCs w:val="20"/>
+          <w:lang w:val="es-MX"/>
+        </w:rPr>
+      </w:pPr>
+      <w:r>
+        <w:rPr>
+          <w:rFonts w:ascii="DePixel" w:hAnsi="DePixel"/>
+          <w:sz w:val="20"/>
+          <w:szCs w:val="20"/>
+          <w:lang w:val="es-MX"/>
+        </w:rPr>
+        <w:t>(</w:t>
+      </w:r>
+      <w:r>
+        <w:rPr>
+          <w:rFonts w:ascii="DePixel" w:hAnsi="DePixel"/>
+          <w:sz w:val="20"/>
+          <w:szCs w:val="20"/>
+          <w:lang w:val="es-MX"/>
+        </w:rPr>
+        <w:t>Imagen de referencia, Autor: NOTAA</w:t>
+      </w:r>
+      <w:r>
+        <w:rPr>
+          <w:rFonts w:ascii="DePixel" w:hAnsi="DePixel"/>
+          <w:sz w:val="20"/>
+          <w:szCs w:val="20"/>
+          <w:lang w:val="es-MX"/>
+        </w:rPr>
+        <w:t xml:space="preserve">): </w:t>
       </w:r>
       <w:r>
         <w:rPr>
@@ -2534,7 +3673,22 @@
             <w14:bevel/>
           </w14:textOutline>
         </w:rPr>
-        <w:t>9. Estilo visual y sonoro</w:t>
+        <w:t>11</w:t>
+      </w:r>
+      <w:r>
+        <w:rPr>
+          <w:rFonts w:ascii="Pixel" w:hAnsi="Pixel"/>
+          <w:color w:val="000000" w:themeColor="text1"/>
+          <w:lang w:val="es-MX"/>
+          <w14:textOutline w14:w="9525" w14:cap="rnd" w14:cmpd="sng" w14:algn="ctr">
+            <w14:solidFill>
+              <w14:srgbClr w14:val="92D050"/>
+            </w14:solidFill>
+            <w14:prstDash w14:val="solid"/>
+            <w14:bevel/>
+          </w14:textOutline>
+        </w:rPr>
+        <w:t>. Estilo visual y sonoro</w:t>
       </w:r>
     </w:p>
     <w:p>
@@ -2608,21 +3762,163 @@
           <w:szCs w:val="20"/>
           <w:lang w:val="es-MX"/>
         </w:rPr>
-        <w:t xml:space="preserve"> recorriendo un laboratorio abandonado</w:t>
-      </w:r>
-      <w:r>
-        <w:rPr>
-          <w:rFonts w:ascii="DePixel" w:hAnsi="DePixel"/>
-          <w:sz w:val="20"/>
-          <w:szCs w:val="20"/>
-          <w:lang w:val="es-MX"/>
-        </w:rPr>
-        <w:t xml:space="preserve">, y se sienta como una misión de extracción. </w:t>
+        <w:t xml:space="preserve"> recorriendo un</w:t>
+      </w:r>
+      <w:r>
+        <w:rPr>
+          <w:rFonts w:ascii="DePixel" w:hAnsi="DePixel"/>
+          <w:sz w:val="20"/>
+          <w:szCs w:val="20"/>
+          <w:lang w:val="es-MX"/>
+        </w:rPr>
+        <w:t xml:space="preserve"> mundo virtual</w:t>
+      </w:r>
+      <w:r>
+        <w:rPr>
+          <w:rFonts w:ascii="DePixel" w:hAnsi="DePixel"/>
+          <w:sz w:val="20"/>
+          <w:szCs w:val="20"/>
+          <w:lang w:val="es-MX"/>
+        </w:rPr>
+        <w:t>, y se sienta como una misión de extracción.</w:t>
       </w:r>
     </w:p>
     <w:p>
       <w:pPr>
         <w:pStyle w:val="Listaconvietas"/>
+        <w:numPr>
+          <w:ilvl w:val="0"/>
+          <w:numId w:val="0"/>
+        </w:numPr>
+        <w:ind w:left="360"/>
+        <w:rPr>
+          <w:rFonts w:ascii="DePixel" w:hAnsi="DePixel"/>
+          <w:sz w:val="20"/>
+          <w:szCs w:val="20"/>
+          <w:lang w:val="es-MX"/>
+        </w:rPr>
+      </w:pPr>
+      <w:r>
+        <w:rPr>
+          <w:rFonts w:ascii="DePixel" w:hAnsi="DePixel"/>
+          <w:sz w:val="20"/>
+          <w:szCs w:val="20"/>
+          <w:lang w:val="es-MX"/>
+        </w:rPr>
+        <w:t xml:space="preserve">-El sistema de sonidos o creación de música como sonidos será en la aplicación de </w:t>
+      </w:r>
+      <w:proofErr w:type="spellStart"/>
+      <w:r>
+        <w:rPr>
+          <w:rFonts w:ascii="DePixel" w:hAnsi="DePixel"/>
+          <w:sz w:val="20"/>
+          <w:szCs w:val="20"/>
+          <w:lang w:val="es-MX"/>
+        </w:rPr>
+        <w:t>Fl</w:t>
+      </w:r>
+      <w:proofErr w:type="spellEnd"/>
+      <w:r>
+        <w:rPr>
+          <w:rFonts w:ascii="DePixel" w:hAnsi="DePixel"/>
+          <w:sz w:val="20"/>
+          <w:szCs w:val="20"/>
+          <w:lang w:val="es-MX"/>
+        </w:rPr>
+        <w:t xml:space="preserve"> Studio 2025. </w:t>
+      </w:r>
+      <w:r>
+        <w:rPr>
+          <w:rFonts w:ascii="DePixel" w:hAnsi="DePixel"/>
+          <w:sz w:val="20"/>
+          <w:szCs w:val="20"/>
+          <w:lang w:val="es-MX"/>
+        </w:rPr>
+        <w:t xml:space="preserve"> </w:t>
+      </w:r>
+    </w:p>
+    <w:p>
+      <w:pPr>
+        <w:pStyle w:val="Listaconvietas"/>
+        <w:numPr>
+          <w:ilvl w:val="0"/>
+          <w:numId w:val="0"/>
+        </w:numPr>
+        <w:ind w:left="360"/>
+        <w:rPr>
+          <w:rFonts w:ascii="DePixel" w:hAnsi="DePixel"/>
+          <w:sz w:val="20"/>
+          <w:szCs w:val="20"/>
+          <w:lang w:val="es-MX"/>
+        </w:rPr>
+      </w:pPr>
+    </w:p>
+    <w:p>
+      <w:pPr>
+        <w:pStyle w:val="Listaconvietas"/>
+        <w:rPr>
+          <w:rFonts w:ascii="DePixel" w:hAnsi="DePixel"/>
+          <w:sz w:val="20"/>
+          <w:szCs w:val="20"/>
+          <w:lang w:val="es-MX"/>
+        </w:rPr>
+      </w:pPr>
+      <w:r>
+        <w:rPr>
+          <w:rFonts w:ascii="DePixel" w:hAnsi="DePixel"/>
+          <w:sz w:val="20"/>
+          <w:szCs w:val="20"/>
+          <w:lang w:val="es-MX"/>
+        </w:rPr>
+        <w:t>Foto de referencia</w:t>
+      </w:r>
+      <w:r>
+        <w:rPr>
+          <w:rFonts w:ascii="DePixel" w:hAnsi="DePixel"/>
+          <w:sz w:val="20"/>
+          <w:szCs w:val="20"/>
+          <w:lang w:val="es-MX"/>
+        </w:rPr>
+        <w:t xml:space="preserve">, </w:t>
+      </w:r>
+      <w:r>
+        <w:rPr>
+          <w:rFonts w:ascii="DePixel" w:hAnsi="DePixel"/>
+          <w:sz w:val="20"/>
+          <w:szCs w:val="20"/>
+          <w:lang w:val="es-MX"/>
+        </w:rPr>
+        <w:t xml:space="preserve">de </w:t>
+      </w:r>
+      <w:proofErr w:type="spellStart"/>
+      <w:r>
+        <w:rPr>
+          <w:rFonts w:ascii="DePixel" w:hAnsi="DePixel"/>
+          <w:sz w:val="20"/>
+          <w:szCs w:val="20"/>
+          <w:lang w:val="es-MX"/>
+        </w:rPr>
+        <w:t>como</w:t>
+      </w:r>
+      <w:proofErr w:type="spellEnd"/>
+      <w:r>
+        <w:rPr>
+          <w:rFonts w:ascii="DePixel" w:hAnsi="DePixel"/>
+          <w:sz w:val="20"/>
+          <w:szCs w:val="20"/>
+          <w:lang w:val="es-MX"/>
+        </w:rPr>
+        <w:t xml:space="preserve"> quiero tener los materiales en el estilo de artes antes especificado:</w:t>
+      </w:r>
+    </w:p>
+    <w:p>
+      <w:pPr>
+        <w:pStyle w:val="Listaconvietas"/>
+        <w:numPr>
+          <w:ilvl w:val="0"/>
+          <w:numId w:val="0"/>
+        </w:numPr>
+        <w:ind w:left="360" w:hanging="360"/>
         <w:rPr>
           <w:rFonts w:ascii="DePixel" w:hAnsi="DePixel"/>
           <w:sz w:val="20"/>
@@ -2635,16 +3931,16 @@
           <w:noProof/>
         </w:rPr>
         <w:drawing>
-          <wp:anchor distT="0" distB="0" distL="114300" distR="114300" simplePos="0" relativeHeight="251668992" behindDoc="1" locked="0" layoutInCell="1" allowOverlap="1" wp14:anchorId="68E6C91F" wp14:editId="6D4C45FA">
+          <wp:anchor distT="0" distB="0" distL="114300" distR="114300" simplePos="0" relativeHeight="251668992" behindDoc="1" locked="0" layoutInCell="1" allowOverlap="1" wp14:anchorId="68E6C91F" wp14:editId="48DBA090">
             <wp:simplePos x="0" y="0"/>
-            <wp:positionH relativeFrom="column">
-              <wp:posOffset>4939030</wp:posOffset>
+            <wp:positionH relativeFrom="margin">
+              <wp:align>right</wp:align>
             </wp:positionH>
             <wp:positionV relativeFrom="paragraph">
-              <wp:posOffset>317500</wp:posOffset>
+              <wp:posOffset>8016</wp:posOffset>
             </wp:positionV>
-            <wp:extent cx="1899285" cy="1737035"/>
-            <wp:effectExtent l="0" t="0" r="5715" b="0"/>
+            <wp:extent cx="2007973" cy="1628942"/>
+            <wp:effectExtent l="0" t="0" r="0" b="9525"/>
             <wp:wrapNone/>
             <wp:docPr id="2084332310" name="Imagen 2" descr="r/Blockbench - After getting into low poly modeling with pixel art textures this year, these are the first 6 models I made. Really in love with this style. :)"/>
             <wp:cNvGraphicFramePr>
@@ -2675,7 +3971,7 @@
                   <pic:spPr bwMode="auto">
                     <a:xfrm>
                       <a:off x="0" y="0"/>
-                      <a:ext cx="1899285" cy="1737035"/>
+                      <a:ext cx="2007973" cy="1628942"/>
                     </a:xfrm>
                     <a:prstGeom prst="rect">
                       <a:avLst/>
@@ -2699,45 +3995,20 @@
       </w:r>
       <w:r>
         <w:rPr>
-          <w:rFonts w:ascii="DePixel" w:hAnsi="DePixel"/>
-          <w:sz w:val="20"/>
-          <w:szCs w:val="20"/>
-          <w:lang w:val="es-MX"/>
-        </w:rPr>
-        <w:t>Foto de referencia, de como quiero tener los materiales en el estilo de artes antes especificado:</w:t>
-      </w:r>
-    </w:p>
-    <w:p>
-      <w:pPr>
-        <w:pStyle w:val="Listaconvietas"/>
-        <w:numPr>
-          <w:ilvl w:val="0"/>
-          <w:numId w:val="0"/>
-        </w:numPr>
-        <w:ind w:left="360" w:hanging="360"/>
-        <w:rPr>
-          <w:rFonts w:ascii="DePixel" w:hAnsi="DePixel"/>
-          <w:sz w:val="20"/>
-          <w:szCs w:val="20"/>
-          <w:lang w:val="es-MX"/>
-        </w:rPr>
-      </w:pPr>
-      <w:r>
-        <w:rPr>
           <w:noProof/>
         </w:rPr>
         <w:drawing>
-          <wp:anchor distT="0" distB="0" distL="114300" distR="114300" simplePos="0" relativeHeight="251673088" behindDoc="0" locked="0" layoutInCell="1" allowOverlap="1" wp14:anchorId="4DE958CC" wp14:editId="222589E6">
+          <wp:anchor distT="0" distB="0" distL="114300" distR="114300" simplePos="0" relativeHeight="251673088" behindDoc="1" locked="0" layoutInCell="1" allowOverlap="1" wp14:anchorId="4DE958CC" wp14:editId="785F6199">
             <wp:simplePos x="0" y="0"/>
-            <wp:positionH relativeFrom="column">
-              <wp:posOffset>-711200</wp:posOffset>
+            <wp:positionH relativeFrom="margin">
+              <wp:posOffset>197708</wp:posOffset>
             </wp:positionH>
             <wp:positionV relativeFrom="paragraph">
-              <wp:posOffset>120650</wp:posOffset>
+              <wp:posOffset>89398</wp:posOffset>
             </wp:positionV>
-            <wp:extent cx="2072640" cy="1286510"/>
-            <wp:effectExtent l="0" t="0" r="3810" b="8890"/>
-            <wp:wrapSquare wrapText="bothSides"/>
+            <wp:extent cx="2362200" cy="1466215"/>
+            <wp:effectExtent l="0" t="0" r="0" b="635"/>
+            <wp:wrapNone/>
             <wp:docPr id="1068220623" name="Imagen 3" descr="r/low_poly - a set of drums and barrels."/>
             <wp:cNvGraphicFramePr>
               <a:graphicFrameLocks xmlns:a="http://schemas.openxmlformats.org/drawingml/2006/main" noChangeAspect="1"/>
@@ -2767,7 +4038,7 @@
                   <pic:spPr bwMode="auto">
                     <a:xfrm>
                       <a:off x="0" y="0"/>
-                      <a:ext cx="2072640" cy="1286510"/>
+                      <a:ext cx="2362200" cy="1466215"/>
                     </a:xfrm>
                     <a:prstGeom prst="rect">
                       <a:avLst/>
@@ -2932,106 +4203,9 @@
             <w14:bevel/>
           </w14:textOutline>
         </w:rPr>
-        <w:t>10. Referentes / juegos similares</w:t>
-      </w:r>
-    </w:p>
-    <w:p>
-      <w:pPr>
-        <w:rPr>
-          <w:rFonts w:ascii="DePixel" w:hAnsi="DePixel"/>
-          <w:sz w:val="20"/>
-          <w:szCs w:val="20"/>
-          <w:lang w:val="es-MX"/>
-        </w:rPr>
-      </w:pPr>
-      <w:r>
-        <w:rPr>
-          <w:rFonts w:ascii="DePixel" w:hAnsi="DePixel"/>
-          <w:sz w:val="20"/>
-          <w:szCs w:val="20"/>
-          <w:lang w:val="es-MX"/>
-        </w:rPr>
-        <w:t xml:space="preserve">Principalmente el juego en el que nos </w:t>
-      </w:r>
-      <w:r>
-        <w:rPr>
-          <w:rFonts w:ascii="DePixel" w:hAnsi="DePixel"/>
-          <w:sz w:val="20"/>
-          <w:szCs w:val="20"/>
-          <w:lang w:val="es-MX"/>
-        </w:rPr>
-        <w:t>basamos</w:t>
-      </w:r>
-      <w:r>
-        <w:rPr>
-          <w:rFonts w:ascii="DePixel" w:hAnsi="DePixel"/>
-          <w:sz w:val="20"/>
-          <w:szCs w:val="20"/>
-          <w:lang w:val="es-MX"/>
-        </w:rPr>
-        <w:t xml:space="preserve"> es </w:t>
-      </w:r>
-      <w:proofErr w:type="spellStart"/>
-      <w:r>
-        <w:rPr>
-          <w:rFonts w:ascii="DePixel" w:hAnsi="DePixel"/>
-          <w:sz w:val="20"/>
-          <w:szCs w:val="20"/>
-          <w:lang w:val="es-MX"/>
-        </w:rPr>
-        <w:t>Lethal</w:t>
-      </w:r>
-      <w:proofErr w:type="spellEnd"/>
-      <w:r>
-        <w:rPr>
-          <w:rFonts w:ascii="DePixel" w:hAnsi="DePixel"/>
-          <w:sz w:val="20"/>
-          <w:szCs w:val="20"/>
-          <w:lang w:val="es-MX"/>
-        </w:rPr>
-        <w:t xml:space="preserve"> Company, la única diferencia es </w:t>
-      </w:r>
-      <w:r>
-        <w:rPr>
-          <w:rFonts w:ascii="DePixel" w:hAnsi="DePixel"/>
-          <w:sz w:val="20"/>
-          <w:szCs w:val="20"/>
-          <w:lang w:val="es-MX"/>
-        </w:rPr>
-        <w:t>que,</w:t>
-      </w:r>
-      <w:r>
-        <w:rPr>
-          <w:rFonts w:ascii="DePixel" w:hAnsi="DePixel"/>
-          <w:sz w:val="20"/>
-          <w:szCs w:val="20"/>
-          <w:lang w:val="es-MX"/>
-        </w:rPr>
-        <w:t xml:space="preserve"> en vez de escapar de los monstruos, </w:t>
-      </w:r>
-      <w:r>
-        <w:rPr>
-          <w:rFonts w:ascii="DePixel" w:hAnsi="DePixel"/>
-          <w:sz w:val="20"/>
-          <w:szCs w:val="20"/>
-          <w:lang w:val="es-MX"/>
-        </w:rPr>
-        <w:t>tú</w:t>
-      </w:r>
-      <w:r>
-        <w:rPr>
-          <w:rFonts w:ascii="DePixel" w:hAnsi="DePixel"/>
-          <w:sz w:val="20"/>
-          <w:szCs w:val="20"/>
-          <w:lang w:val="es-MX"/>
-        </w:rPr>
-        <w:t xml:space="preserve"> y tu equipo tienen que contenerlos, matarlos o solamente recuperar artefactos del laboratorio. </w:t>
-      </w:r>
-    </w:p>
-    <w:p>
-      <w:pPr>
-        <w:pStyle w:val="Ttulo1"/>
-        <w:jc w:val="center"/>
+        <w:t>1</w:t>
+      </w:r>
+      <w:r>
         <w:rPr>
           <w:rFonts w:ascii="Pixel" w:hAnsi="Pixel"/>
           <w:color w:val="000000" w:themeColor="text1"/>
@@ -3044,7 +4218,8 @@
             <w14:bevel/>
           </w14:textOutline>
         </w:rPr>
-      </w:pPr>
+        <w:t>2</w:t>
+      </w:r>
       <w:r>
         <w:rPr>
           <w:rFonts w:ascii="Pixel" w:hAnsi="Pixel"/>
@@ -3058,8 +4233,7 @@
             <w14:bevel/>
           </w14:textOutline>
         </w:rPr>
-        <w:lastRenderedPageBreak/>
-        <w:t>11. Historia (resumen)</w:t>
+        <w:t>. Referentes / juegos similares</w:t>
       </w:r>
     </w:p>
     <w:p>
@@ -3078,16 +4252,146 @@
           <w:szCs w:val="20"/>
           <w:lang w:val="es-MX"/>
         </w:rPr>
-        <w:t>En un universo alterno, tras romperse acuerdos internacionales y escalar tensiones entre potencias, una guerra global impulsa proyectos experimentales. México participa como aliado estratégico con infraestructura y un laboratorio fuera de la Ciudad de México, supervisado por agentes de Estados Unidos, enfocado en tecnología médica y de apoyo para el combate, incluyendo investigación extrema sobre regeneración y modificación corporal. Un contribuyente clave, Elliot Prince, cruza límites éticos buscando escapar de la muerte y detona un evento que deja como resultado a 'V44', una entidad/resultado anómalo de alto valor militar. Tras la captura y pruebas, V44 se vuelve crucial en el conflicto, pero el laboratorio queda con secuelas: instalaciones abandonadas, documentos incompletos y rastros del proyecto. El jugador entra a recuperar evidencia, materiales y, si es posible, entidades, mientras la amenaza y el misterio se revelan mediante notas, documentos y órdenes de superiores.</w:t>
+        <w:t xml:space="preserve">Principalmente el juego en el que nos </w:t>
+      </w:r>
+      <w:r>
+        <w:rPr>
+          <w:rFonts w:ascii="DePixel" w:hAnsi="DePixel"/>
+          <w:sz w:val="20"/>
+          <w:szCs w:val="20"/>
+          <w:lang w:val="es-MX"/>
+        </w:rPr>
+        <w:t>basamos</w:t>
+      </w:r>
+      <w:r>
+        <w:rPr>
+          <w:rFonts w:ascii="DePixel" w:hAnsi="DePixel"/>
+          <w:sz w:val="20"/>
+          <w:szCs w:val="20"/>
+          <w:lang w:val="es-MX"/>
+        </w:rPr>
+        <w:t xml:space="preserve"> es </w:t>
+      </w:r>
+      <w:proofErr w:type="spellStart"/>
+      <w:r>
+        <w:rPr>
+          <w:rFonts w:ascii="DePixel" w:hAnsi="DePixel"/>
+          <w:sz w:val="20"/>
+          <w:szCs w:val="20"/>
+          <w:lang w:val="es-MX"/>
+        </w:rPr>
+        <w:t>Lethal</w:t>
+      </w:r>
+      <w:proofErr w:type="spellEnd"/>
+      <w:r>
+        <w:rPr>
+          <w:rFonts w:ascii="DePixel" w:hAnsi="DePixel"/>
+          <w:sz w:val="20"/>
+          <w:szCs w:val="20"/>
+          <w:lang w:val="es-MX"/>
+        </w:rPr>
+        <w:t xml:space="preserve"> Company, la única diferencia es </w:t>
+      </w:r>
+      <w:r>
+        <w:rPr>
+          <w:rFonts w:ascii="DePixel" w:hAnsi="DePixel"/>
+          <w:sz w:val="20"/>
+          <w:szCs w:val="20"/>
+          <w:lang w:val="es-MX"/>
+        </w:rPr>
+        <w:t>que,</w:t>
+      </w:r>
+      <w:r>
+        <w:rPr>
+          <w:rFonts w:ascii="DePixel" w:hAnsi="DePixel"/>
+          <w:sz w:val="20"/>
+          <w:szCs w:val="20"/>
+          <w:lang w:val="es-MX"/>
+        </w:rPr>
+        <w:t xml:space="preserve"> en vez de escapar de los monstruos</w:t>
+      </w:r>
+      <w:r>
+        <w:rPr>
+          <w:rFonts w:ascii="DePixel" w:hAnsi="DePixel"/>
+          <w:sz w:val="20"/>
+          <w:szCs w:val="20"/>
+          <w:lang w:val="es-MX"/>
+        </w:rPr>
+        <w:t xml:space="preserve"> y recoger basura</w:t>
+      </w:r>
+      <w:r>
+        <w:rPr>
+          <w:rFonts w:ascii="DePixel" w:hAnsi="DePixel"/>
+          <w:sz w:val="20"/>
+          <w:szCs w:val="20"/>
+          <w:lang w:val="es-MX"/>
+        </w:rPr>
+        <w:t xml:space="preserve">, </w:t>
+      </w:r>
+      <w:r>
+        <w:rPr>
+          <w:rFonts w:ascii="DePixel" w:hAnsi="DePixel"/>
+          <w:sz w:val="20"/>
+          <w:szCs w:val="20"/>
+          <w:lang w:val="es-MX"/>
+        </w:rPr>
+        <w:t>tú</w:t>
+      </w:r>
+      <w:r>
+        <w:rPr>
+          <w:rFonts w:ascii="DePixel" w:hAnsi="DePixel"/>
+          <w:sz w:val="20"/>
+          <w:szCs w:val="20"/>
+          <w:lang w:val="es-MX"/>
+        </w:rPr>
+        <w:t xml:space="preserve"> y tu equipo tienen que contenerlos, </w:t>
+      </w:r>
+      <w:r>
+        <w:rPr>
+          <w:rFonts w:ascii="DePixel" w:hAnsi="DePixel"/>
+          <w:sz w:val="20"/>
+          <w:szCs w:val="20"/>
+          <w:lang w:val="es-MX"/>
+        </w:rPr>
+        <w:t>destruirlos</w:t>
+      </w:r>
+      <w:r>
+        <w:rPr>
+          <w:rFonts w:ascii="DePixel" w:hAnsi="DePixel"/>
+          <w:sz w:val="20"/>
+          <w:szCs w:val="20"/>
+          <w:lang w:val="es-MX"/>
+        </w:rPr>
+        <w:t xml:space="preserve"> o solamente recuperar artefactos de</w:t>
+      </w:r>
+      <w:r>
+        <w:rPr>
+          <w:rFonts w:ascii="DePixel" w:hAnsi="DePixel"/>
+          <w:sz w:val="20"/>
+          <w:szCs w:val="20"/>
+          <w:lang w:val="es-MX"/>
+        </w:rPr>
+        <w:t>ntro del mundo virtual</w:t>
+      </w:r>
+      <w:r>
+        <w:rPr>
+          <w:rFonts w:ascii="DePixel" w:hAnsi="DePixel"/>
+          <w:sz w:val="20"/>
+          <w:szCs w:val="20"/>
+          <w:lang w:val="es-MX"/>
+        </w:rPr>
+        <w:t>.</w:t>
       </w:r>
     </w:p>
     <w:p>
       <w:pPr>
-        <w:pStyle w:val="Ttulo1"/>
-        <w:jc w:val="center"/>
-        <w:rPr>
-          <w:rFonts w:ascii="Pixel" w:hAnsi="Pixel"/>
+        <w:rPr>
+          <w:rFonts w:ascii="Pixel" w:eastAsiaTheme="majorEastAsia" w:hAnsi="Pixel" w:cstheme="majorBidi"/>
+          <w:b/>
+          <w:bCs/>
           <w:color w:val="000000" w:themeColor="text1"/>
+          <w:sz w:val="28"/>
+          <w:szCs w:val="28"/>
           <w:lang w:val="es-MX"/>
           <w14:textOutline w14:w="9525" w14:cap="rnd" w14:cmpd="sng" w14:algn="ctr">
             <w14:solidFill>
@@ -3100,8 +4404,12 @@
       </w:pPr>
       <w:r>
         <w:rPr>
-          <w:rFonts w:ascii="Pixel" w:hAnsi="Pixel"/>
+          <w:rFonts w:ascii="Pixel" w:eastAsiaTheme="majorEastAsia" w:hAnsi="Pixel" w:cstheme="majorBidi"/>
+          <w:b/>
+          <w:bCs/>
           <w:color w:val="000000" w:themeColor="text1"/>
+          <w:sz w:val="28"/>
+          <w:szCs w:val="28"/>
           <w:lang w:val="es-MX"/>
           <w14:textOutline w14:w="9525" w14:cap="rnd" w14:cmpd="sng" w14:algn="ctr">
             <w14:solidFill>
@@ -3111,12 +4419,16 @@
             <w14:bevel/>
           </w14:textOutline>
         </w:rPr>
-        <w:t>1</w:t>
-      </w:r>
-      <w:r>
-        <w:rPr>
-          <w:rFonts w:ascii="Pixel" w:hAnsi="Pixel"/>
+        <w:t xml:space="preserve">13. Marketing y ventas del juego en el que me baso </w:t>
+      </w:r>
+      <w:r>
+        <w:rPr>
+          <w:rFonts w:ascii="Times New Roman" w:eastAsiaTheme="majorEastAsia" w:hAnsi="Times New Roman" w:cs="Times New Roman"/>
+          <w:b/>
+          <w:bCs/>
           <w:color w:val="000000" w:themeColor="text1"/>
+          <w:sz w:val="28"/>
+          <w:szCs w:val="28"/>
           <w:lang w:val="es-MX"/>
           <w14:textOutline w14:w="9525" w14:cap="rnd" w14:cmpd="sng" w14:algn="ctr">
             <w14:solidFill>
@@ -3126,12 +4438,16 @@
             <w14:bevel/>
           </w14:textOutline>
         </w:rPr>
-        <w:t>2</w:t>
-      </w:r>
-      <w:r>
-        <w:rPr>
-          <w:rFonts w:ascii="Pixel" w:hAnsi="Pixel"/>
+        <w:t>“</w:t>
+      </w:r>
+      <w:r>
+        <w:rPr>
+          <w:rFonts w:ascii="Pixel" w:eastAsiaTheme="majorEastAsia" w:hAnsi="Pixel" w:cstheme="majorBidi"/>
+          <w:b/>
+          <w:bCs/>
           <w:color w:val="000000" w:themeColor="text1"/>
+          <w:sz w:val="28"/>
+          <w:szCs w:val="28"/>
           <w:lang w:val="es-MX"/>
           <w14:textOutline w14:w="9525" w14:cap="rnd" w14:cmpd="sng" w14:algn="ctr">
             <w14:solidFill>
@@ -3141,13 +4457,16 @@
             <w14:bevel/>
           </w14:textOutline>
         </w:rPr>
-        <w:t xml:space="preserve">. </w:t>
-      </w:r>
-      <w:proofErr w:type="spellStart"/>
-      <w:r>
-        <w:rPr>
-          <w:rFonts w:ascii="Pixel" w:hAnsi="Pixel"/>
+        <w:t>LETHAL COMPANY</w:t>
+      </w:r>
+      <w:r>
+        <w:rPr>
+          <w:rFonts w:ascii="Times New Roman" w:eastAsiaTheme="majorEastAsia" w:hAnsi="Times New Roman" w:cs="Times New Roman"/>
+          <w:b/>
+          <w:bCs/>
           <w:color w:val="000000" w:themeColor="text1"/>
+          <w:sz w:val="28"/>
+          <w:szCs w:val="28"/>
           <w:lang w:val="es-MX"/>
           <w14:textOutline w14:w="9525" w14:cap="rnd" w14:cmpd="sng" w14:algn="ctr">
             <w14:solidFill>
@@ -3157,13 +4476,16 @@
             <w14:bevel/>
           </w14:textOutline>
         </w:rPr>
-        <w:t>Roadmap</w:t>
-      </w:r>
-      <w:proofErr w:type="spellEnd"/>
-      <w:r>
-        <w:rPr>
-          <w:rFonts w:ascii="Pixel" w:hAnsi="Pixel"/>
+        <w:t>”</w:t>
+      </w:r>
+      <w:r>
+        <w:rPr>
+          <w:rFonts w:ascii="Pixel" w:eastAsiaTheme="majorEastAsia" w:hAnsi="Pixel" w:cstheme="majorBidi"/>
+          <w:b/>
+          <w:bCs/>
           <w:color w:val="000000" w:themeColor="text1"/>
+          <w:sz w:val="28"/>
+          <w:szCs w:val="28"/>
           <w:lang w:val="es-MX"/>
           <w14:textOutline w14:w="9525" w14:cap="rnd" w14:cmpd="sng" w14:algn="ctr">
             <w14:solidFill>
@@ -3173,66 +4495,166 @@
             <w14:bevel/>
           </w14:textOutline>
         </w:rPr>
-        <w:t xml:space="preserve"> (propuesta por fases)</w:t>
+        <w:t>:</w:t>
       </w:r>
     </w:p>
     <w:p>
       <w:pPr>
         <w:rPr>
           <w:rFonts w:ascii="DePixel" w:hAnsi="DePixel"/>
-          <w:b/>
-          <w:bCs/>
-          <w:i/>
-          <w:iCs/>
-          <w:sz w:val="20"/>
-          <w:szCs w:val="20"/>
-          <w:u w:val="single"/>
-          <w:lang w:val="es-MX"/>
-        </w:rPr>
-      </w:pPr>
-      <w:r>
-        <w:rPr>
-          <w:rFonts w:ascii="DePixel" w:hAnsi="DePixel"/>
-          <w:b/>
-          <w:bCs/>
-          <w:i/>
-          <w:iCs/>
-          <w:sz w:val="20"/>
-          <w:szCs w:val="20"/>
-          <w:u w:val="single"/>
-          <w:lang w:val="es-MX"/>
-        </w:rPr>
-        <w:t xml:space="preserve">Fase 1 - Prototipo del </w:t>
+          <w:sz w:val="20"/>
+          <w:szCs w:val="20"/>
+          <w:lang w:val="es-MX"/>
+        </w:rPr>
+      </w:pPr>
+      <w:r>
+        <w:rPr>
+          <w:rFonts w:ascii="DePixel" w:hAnsi="DePixel"/>
+          <w:sz w:val="20"/>
+          <w:szCs w:val="20"/>
+          <w:lang w:val="es-MX"/>
+        </w:rPr>
+        <w:t xml:space="preserve">En 23 de octubre es cuando sacan el juego de </w:t>
       </w:r>
       <w:proofErr w:type="spellStart"/>
       <w:r>
         <w:rPr>
           <w:rFonts w:ascii="DePixel" w:hAnsi="DePixel"/>
-          <w:b/>
-          <w:bCs/>
-          <w:i/>
-          <w:iCs/>
-          <w:sz w:val="20"/>
-          <w:szCs w:val="20"/>
-          <w:u w:val="single"/>
-          <w:lang w:val="es-MX"/>
-        </w:rPr>
-        <w:t>core</w:t>
+          <w:sz w:val="20"/>
+          <w:szCs w:val="20"/>
+          <w:lang w:val="es-MX"/>
+        </w:rPr>
+        <w:t>Lethal</w:t>
       </w:r>
       <w:proofErr w:type="spellEnd"/>
       <w:r>
         <w:rPr>
           <w:rFonts w:ascii="DePixel" w:hAnsi="DePixel"/>
-          <w:b/>
-          <w:bCs/>
-          <w:i/>
-          <w:iCs/>
-          <w:sz w:val="20"/>
-          <w:szCs w:val="20"/>
-          <w:u w:val="single"/>
-          <w:lang w:val="es-MX"/>
-        </w:rPr>
-        <w:t xml:space="preserve"> (2 semanas):</w:t>
+          <w:sz w:val="20"/>
+          <w:szCs w:val="20"/>
+          <w:lang w:val="es-MX"/>
+        </w:rPr>
+        <w:t xml:space="preserve"> Company al mercado en </w:t>
+      </w:r>
+      <w:proofErr w:type="spellStart"/>
+      <w:r>
+        <w:rPr>
+          <w:rFonts w:ascii="DePixel" w:hAnsi="DePixel"/>
+          <w:sz w:val="20"/>
+          <w:szCs w:val="20"/>
+          <w:lang w:val="es-MX"/>
+        </w:rPr>
+        <w:t>Steam</w:t>
+      </w:r>
+      <w:proofErr w:type="spellEnd"/>
+      <w:r>
+        <w:rPr>
+          <w:rFonts w:ascii="DePixel" w:hAnsi="DePixel"/>
+          <w:sz w:val="20"/>
+          <w:szCs w:val="20"/>
+          <w:lang w:val="es-MX"/>
+        </w:rPr>
+        <w:t xml:space="preserve">, anteriormente estuvo su juego en listado en un genero de horror de los </w:t>
+      </w:r>
+      <w:proofErr w:type="gramStart"/>
+      <w:r>
+        <w:rPr>
+          <w:rFonts w:ascii="DePixel" w:hAnsi="DePixel"/>
+          <w:sz w:val="20"/>
+          <w:szCs w:val="20"/>
+          <w:lang w:val="es-MX"/>
+        </w:rPr>
+        <w:t>próximos juego cooperativo</w:t>
+      </w:r>
+      <w:proofErr w:type="gramEnd"/>
+      <w:r>
+        <w:rPr>
+          <w:rFonts w:ascii="DePixel" w:hAnsi="DePixel"/>
+          <w:sz w:val="20"/>
+          <w:szCs w:val="20"/>
+          <w:lang w:val="es-MX"/>
+        </w:rPr>
+        <w:t xml:space="preserve"> que iban a ser lanzados en </w:t>
+      </w:r>
+      <w:proofErr w:type="spellStart"/>
+      <w:r>
+        <w:rPr>
+          <w:rFonts w:ascii="DePixel" w:hAnsi="DePixel"/>
+          <w:sz w:val="20"/>
+          <w:szCs w:val="20"/>
+          <w:lang w:val="es-MX"/>
+        </w:rPr>
+        <w:t>Steam</w:t>
+      </w:r>
+      <w:proofErr w:type="spellEnd"/>
+      <w:r>
+        <w:rPr>
+          <w:rFonts w:ascii="DePixel" w:hAnsi="DePixel"/>
+          <w:sz w:val="20"/>
+          <w:szCs w:val="20"/>
+          <w:lang w:val="es-MX"/>
+        </w:rPr>
+        <w:t xml:space="preserve">, pero ellos no ganaron ni siquiera ese concurso ni fueron los top 10. Sus ventas aproximadas en las primeras semanas fueron de: “642,000 copias” y “US $5.7 MILLONES BRUTOS” en las primeras 3 semanas, vendiendo su juego como Early </w:t>
+      </w:r>
+      <w:proofErr w:type="spellStart"/>
+      <w:r>
+        <w:rPr>
+          <w:rFonts w:ascii="DePixel" w:hAnsi="DePixel"/>
+          <w:sz w:val="20"/>
+          <w:szCs w:val="20"/>
+          <w:lang w:val="es-MX"/>
+        </w:rPr>
+        <w:t>Acces</w:t>
+      </w:r>
+      <w:proofErr w:type="spellEnd"/>
+      <w:r>
+        <w:rPr>
+          <w:rFonts w:ascii="DePixel" w:hAnsi="DePixel"/>
+          <w:sz w:val="20"/>
+          <w:szCs w:val="20"/>
+          <w:lang w:val="es-MX"/>
+        </w:rPr>
+        <w:t xml:space="preserve"> a 10 </w:t>
+      </w:r>
+      <w:proofErr w:type="spellStart"/>
+      <w:r>
+        <w:rPr>
+          <w:rFonts w:ascii="DePixel" w:hAnsi="DePixel"/>
+          <w:sz w:val="20"/>
+          <w:szCs w:val="20"/>
+          <w:lang w:val="es-MX"/>
+        </w:rPr>
+        <w:t>dolares</w:t>
+      </w:r>
+      <w:proofErr w:type="spellEnd"/>
+      <w:r>
+        <w:rPr>
+          <w:rFonts w:ascii="DePixel" w:hAnsi="DePixel"/>
+          <w:sz w:val="20"/>
+          <w:szCs w:val="20"/>
+          <w:lang w:val="es-MX"/>
+        </w:rPr>
+        <w:t xml:space="preserve"> en </w:t>
+      </w:r>
+      <w:proofErr w:type="spellStart"/>
+      <w:r>
+        <w:rPr>
+          <w:rFonts w:ascii="DePixel" w:hAnsi="DePixel"/>
+          <w:sz w:val="20"/>
+          <w:szCs w:val="20"/>
+          <w:lang w:val="es-MX"/>
+        </w:rPr>
+        <w:t>Steam</w:t>
+      </w:r>
+      <w:proofErr w:type="spellEnd"/>
+      <w:r>
+        <w:rPr>
+          <w:rFonts w:ascii="DePixel" w:hAnsi="DePixel"/>
+          <w:sz w:val="20"/>
+          <w:szCs w:val="20"/>
+          <w:lang w:val="es-MX"/>
+        </w:rPr>
+        <w:t>.</w:t>
       </w:r>
     </w:p>
     <w:p>
@@ -3251,7 +4673,7 @@
           <w:szCs w:val="20"/>
           <w:lang w:val="es-MX"/>
         </w:rPr>
-        <w:t xml:space="preserve">Movimiento, interacción y recolección de </w:t>
+        <w:t xml:space="preserve">Lo que impulso su juego además de que fue creado por solo una persona, fueron en realidad las redes sociales, y su innovación con el arte inusual de bajos polígonos, como también en su sistema de chat de voz como su jugabilidad que era </w:t>
       </w:r>
       <w:proofErr w:type="spellStart"/>
       <w:r>
@@ -3261,7 +4683,7 @@
           <w:szCs w:val="20"/>
           <w:lang w:val="es-MX"/>
         </w:rPr>
-        <w:t>loot</w:t>
+        <w:t>memeable</w:t>
       </w:r>
       <w:proofErr w:type="spellEnd"/>
       <w:r>
@@ -3271,7 +4693,56 @@
           <w:szCs w:val="20"/>
           <w:lang w:val="es-MX"/>
         </w:rPr>
-        <w:t>.</w:t>
+        <w:t xml:space="preserve">, al punto de que era muy </w:t>
+      </w:r>
+      <w:proofErr w:type="spellStart"/>
+      <w:r>
+        <w:rPr>
+          <w:rFonts w:ascii="DePixel" w:hAnsi="DePixel"/>
+          <w:sz w:val="20"/>
+          <w:szCs w:val="20"/>
+          <w:lang w:val="es-MX"/>
+        </w:rPr>
+        <w:t>clipeable</w:t>
+      </w:r>
+      <w:proofErr w:type="spellEnd"/>
+      <w:r>
+        <w:rPr>
+          <w:rFonts w:ascii="DePixel" w:hAnsi="DePixel"/>
+          <w:sz w:val="20"/>
+          <w:szCs w:val="20"/>
+          <w:lang w:val="es-MX"/>
+        </w:rPr>
+        <w:t xml:space="preserve">. Y fue por eso </w:t>
+      </w:r>
+      <w:proofErr w:type="gramStart"/>
+      <w:r>
+        <w:rPr>
+          <w:rFonts w:ascii="DePixel" w:hAnsi="DePixel"/>
+          <w:sz w:val="20"/>
+          <w:szCs w:val="20"/>
+          <w:lang w:val="es-MX"/>
+        </w:rPr>
+        <w:t>que</w:t>
+      </w:r>
+      <w:proofErr w:type="gramEnd"/>
+      <w:r>
+        <w:rPr>
+          <w:rFonts w:ascii="DePixel" w:hAnsi="DePixel"/>
+          <w:sz w:val="20"/>
+          <w:szCs w:val="20"/>
+          <w:lang w:val="es-MX"/>
+        </w:rPr>
+        <w:t xml:space="preserve"> se impulso en redes sociales y los creadores de contenido los impulso mas en vender su juego, porque era necesario jugar en equipo, además de que el creador del juego </w:t>
+      </w:r>
+      <w:r>
+        <w:rPr>
+          <w:rFonts w:ascii="DePixel" w:hAnsi="DePixel"/>
+          <w:sz w:val="20"/>
+          <w:szCs w:val="20"/>
+          <w:lang w:val="es-MX"/>
+        </w:rPr>
+        <w:t xml:space="preserve">dejaba que sus usuarios hicieran sus propios mods, y después de su éxito masivo siguió actualizando el juego hasta crear niveles mas complejos. </w:t>
       </w:r>
     </w:p>
     <w:p>
@@ -3290,7 +4761,7 @@
           <w:szCs w:val="20"/>
           <w:lang w:val="es-MX"/>
         </w:rPr>
-        <w:t>1 criatura con comportamiento básico (patrulla + persecución).</w:t>
+        <w:t xml:space="preserve"> </w:t>
       </w:r>
     </w:p>
     <w:p>
@@ -3309,7 +4780,7 @@
           <w:szCs w:val="20"/>
           <w:lang w:val="es-MX"/>
         </w:rPr>
-        <w:t>Extracción funcional y economía mínima.</w:t>
+        <w:t xml:space="preserve">Expectativas de venta (Mias frente a la competencia): </w:t>
       </w:r>
     </w:p>
     <w:p>
@@ -3321,427 +4792,14 @@
           <w:lang w:val="es-MX"/>
         </w:rPr>
       </w:pPr>
-      <w:r>
-        <w:rPr>
-          <w:rFonts w:ascii="DePixel" w:hAnsi="DePixel"/>
-          <w:sz w:val="20"/>
-          <w:szCs w:val="20"/>
-          <w:lang w:val="es-MX"/>
-        </w:rPr>
-        <w:t xml:space="preserve">Mapa base para ver </w:t>
-      </w:r>
-      <w:r>
-        <w:rPr>
-          <w:rFonts w:ascii="DePixel" w:hAnsi="DePixel"/>
-          <w:sz w:val="20"/>
-          <w:szCs w:val="20"/>
-          <w:lang w:val="es-MX"/>
-        </w:rPr>
-        <w:t xml:space="preserve">las interacciones del jugador y enemigo en el ambiente. </w:t>
-      </w:r>
     </w:p>
     <w:p>
       <w:pPr>
-        <w:rPr>
-          <w:rFonts w:ascii="DePixel" w:hAnsi="DePixel"/>
-          <w:b/>
-          <w:bCs/>
-          <w:i/>
-          <w:iCs/>
-          <w:sz w:val="20"/>
-          <w:szCs w:val="20"/>
-          <w:u w:val="single"/>
-          <w:lang w:val="es-MX"/>
-        </w:rPr>
-      </w:pPr>
-      <w:r>
-        <w:rPr>
-          <w:rFonts w:ascii="DePixel" w:hAnsi="DePixel"/>
-          <w:b/>
-          <w:bCs/>
-          <w:i/>
-          <w:iCs/>
-          <w:sz w:val="20"/>
-          <w:szCs w:val="20"/>
-          <w:u w:val="single"/>
-          <w:lang w:val="es-MX"/>
-        </w:rPr>
-        <w:t>Fase 2 - MVP jugable (</w:t>
-      </w:r>
-      <w:r>
-        <w:rPr>
-          <w:rFonts w:ascii="DePixel" w:hAnsi="DePixel"/>
-          <w:b/>
-          <w:bCs/>
-          <w:i/>
-          <w:iCs/>
-          <w:sz w:val="20"/>
-          <w:szCs w:val="20"/>
-          <w:u w:val="single"/>
-          <w:lang w:val="es-MX"/>
-        </w:rPr>
-        <w:t>2-4</w:t>
-      </w:r>
-      <w:r>
-        <w:rPr>
-          <w:rFonts w:ascii="DePixel" w:hAnsi="DePixel"/>
-          <w:b/>
-          <w:bCs/>
-          <w:i/>
-          <w:iCs/>
-          <w:sz w:val="20"/>
-          <w:szCs w:val="20"/>
-          <w:u w:val="single"/>
-          <w:lang w:val="es-MX"/>
-        </w:rPr>
-        <w:t xml:space="preserve"> semanas):</w:t>
-      </w:r>
-    </w:p>
-    <w:p>
-      <w:pPr>
-        <w:rPr>
-          <w:rFonts w:ascii="DePixel" w:hAnsi="DePixel"/>
-          <w:sz w:val="20"/>
-          <w:szCs w:val="20"/>
-          <w:lang w:val="es-MX"/>
-        </w:rPr>
-      </w:pPr>
-      <w:r>
-        <w:rPr>
-          <w:rFonts w:ascii="DePixel" w:hAnsi="DePixel"/>
-          <w:sz w:val="20"/>
-          <w:szCs w:val="20"/>
-          <w:lang w:val="es-MX"/>
-        </w:rPr>
-        <w:t xml:space="preserve">Mapa </w:t>
-      </w:r>
-      <w:r>
-        <w:rPr>
-          <w:rFonts w:ascii="DePixel" w:hAnsi="DePixel"/>
-          <w:sz w:val="20"/>
-          <w:szCs w:val="20"/>
-          <w:lang w:val="es-MX"/>
-        </w:rPr>
-        <w:t xml:space="preserve">completamente terminado </w:t>
-      </w:r>
-    </w:p>
-    <w:p>
-      <w:pPr>
-        <w:rPr>
-          <w:rFonts w:ascii="DePixel" w:hAnsi="DePixel"/>
-          <w:sz w:val="20"/>
-          <w:szCs w:val="20"/>
-          <w:lang w:val="es-MX"/>
-        </w:rPr>
-      </w:pPr>
-      <w:r>
-        <w:rPr>
-          <w:rFonts w:ascii="DePixel" w:hAnsi="DePixel"/>
-          <w:sz w:val="20"/>
-          <w:szCs w:val="20"/>
-          <w:lang w:val="es-MX"/>
-        </w:rPr>
-        <w:t>3 criaturas y balance inicial.</w:t>
-      </w:r>
-    </w:p>
-    <w:p>
-      <w:pPr>
-        <w:rPr>
-          <w:rFonts w:ascii="DePixel" w:hAnsi="DePixel"/>
-          <w:sz w:val="20"/>
-          <w:szCs w:val="20"/>
-          <w:lang w:val="es-MX"/>
-        </w:rPr>
-      </w:pPr>
-      <w:r>
-        <w:rPr>
-          <w:rFonts w:ascii="DePixel" w:hAnsi="DePixel"/>
-          <w:sz w:val="20"/>
-          <w:szCs w:val="20"/>
-          <w:lang w:val="es-MX"/>
-        </w:rPr>
-        <w:t>Herramientas (trampa/aturdidor/contenedor) y UI mínima.</w:t>
-      </w:r>
-    </w:p>
-    <w:p>
-      <w:pPr>
-        <w:rPr>
-          <w:rFonts w:ascii="DePixel" w:hAnsi="DePixel"/>
-          <w:b/>
-          <w:bCs/>
-          <w:i/>
-          <w:iCs/>
-          <w:sz w:val="20"/>
-          <w:szCs w:val="20"/>
-          <w:u w:val="single"/>
-          <w:lang w:val="es-MX"/>
-        </w:rPr>
-      </w:pPr>
-      <w:r>
-        <w:rPr>
-          <w:rFonts w:ascii="DePixel" w:hAnsi="DePixel"/>
-          <w:b/>
-          <w:bCs/>
-          <w:i/>
-          <w:iCs/>
-          <w:sz w:val="20"/>
-          <w:szCs w:val="20"/>
-          <w:u w:val="single"/>
-          <w:lang w:val="es-MX"/>
-        </w:rPr>
-        <w:t xml:space="preserve">Fase 3 - </w:t>
-      </w:r>
-      <w:r>
-        <w:rPr>
-          <w:rFonts w:ascii="DePixel" w:hAnsi="DePixel"/>
-          <w:b/>
-          <w:bCs/>
-          <w:i/>
-          <w:iCs/>
-          <w:sz w:val="20"/>
-          <w:szCs w:val="20"/>
-          <w:u w:val="single"/>
-          <w:lang w:val="es-MX"/>
-        </w:rPr>
-        <w:t>Optimización</w:t>
-      </w:r>
-      <w:r>
-        <w:rPr>
-          <w:rFonts w:ascii="DePixel" w:hAnsi="DePixel"/>
-          <w:b/>
-          <w:bCs/>
-          <w:i/>
-          <w:iCs/>
-          <w:sz w:val="20"/>
-          <w:szCs w:val="20"/>
-          <w:u w:val="single"/>
-          <w:lang w:val="es-MX"/>
-        </w:rPr>
-        <w:t xml:space="preserve"> (4-</w:t>
-      </w:r>
-      <w:r>
-        <w:rPr>
-          <w:rFonts w:ascii="DePixel" w:hAnsi="DePixel"/>
-          <w:b/>
-          <w:bCs/>
-          <w:i/>
-          <w:iCs/>
-          <w:sz w:val="20"/>
-          <w:szCs w:val="20"/>
-          <w:u w:val="single"/>
-          <w:lang w:val="es-MX"/>
-        </w:rPr>
-        <w:t>5</w:t>
-      </w:r>
-      <w:r>
-        <w:rPr>
-          <w:rFonts w:ascii="DePixel" w:hAnsi="DePixel"/>
-          <w:b/>
-          <w:bCs/>
-          <w:i/>
-          <w:iCs/>
-          <w:sz w:val="20"/>
-          <w:szCs w:val="20"/>
-          <w:u w:val="single"/>
-          <w:lang w:val="es-MX"/>
-        </w:rPr>
-        <w:t xml:space="preserve"> semanas):</w:t>
-      </w:r>
-    </w:p>
-    <w:p>
-      <w:pPr>
-        <w:rPr>
-          <w:rFonts w:ascii="DePixel" w:hAnsi="DePixel"/>
-          <w:sz w:val="20"/>
-          <w:szCs w:val="20"/>
-          <w:lang w:val="es-MX"/>
-        </w:rPr>
-      </w:pPr>
-      <w:r>
-        <w:rPr>
-          <w:rFonts w:ascii="DePixel" w:hAnsi="DePixel"/>
-          <w:sz w:val="20"/>
-          <w:szCs w:val="20"/>
-          <w:lang w:val="es-MX"/>
-        </w:rPr>
-        <w:t xml:space="preserve">Pulido de atmósfera (audio, iluminación, </w:t>
-      </w:r>
-      <w:proofErr w:type="spellStart"/>
-      <w:r>
-        <w:rPr>
-          <w:rFonts w:ascii="DePixel" w:hAnsi="DePixel"/>
-          <w:sz w:val="20"/>
-          <w:szCs w:val="20"/>
-          <w:lang w:val="es-MX"/>
-        </w:rPr>
-        <w:t>feedback</w:t>
-      </w:r>
-      <w:proofErr w:type="spellEnd"/>
-      <w:r>
-        <w:rPr>
-          <w:rFonts w:ascii="DePixel" w:hAnsi="DePixel"/>
-          <w:sz w:val="20"/>
-          <w:szCs w:val="20"/>
-          <w:lang w:val="es-MX"/>
-        </w:rPr>
-        <w:t>)</w:t>
-      </w:r>
-      <w:r>
-        <w:rPr>
-          <w:rFonts w:ascii="DePixel" w:hAnsi="DePixel"/>
-          <w:sz w:val="20"/>
-          <w:szCs w:val="20"/>
-          <w:lang w:val="es-MX"/>
-        </w:rPr>
-        <w:t>.</w:t>
-      </w:r>
-    </w:p>
-    <w:p>
-      <w:pPr>
-        <w:rPr>
-          <w:rFonts w:ascii="DePixel" w:hAnsi="DePixel"/>
-          <w:sz w:val="20"/>
-          <w:szCs w:val="20"/>
-          <w:lang w:val="es-MX"/>
-        </w:rPr>
-      </w:pPr>
-      <w:r>
-        <w:rPr>
-          <w:rFonts w:ascii="DePixel" w:hAnsi="DePixel"/>
-          <w:sz w:val="20"/>
-          <w:szCs w:val="20"/>
-          <w:lang w:val="es-MX"/>
-        </w:rPr>
-        <w:t>Optimización</w:t>
-      </w:r>
-      <w:r>
-        <w:rPr>
-          <w:rFonts w:ascii="DePixel" w:hAnsi="DePixel"/>
-          <w:sz w:val="20"/>
-          <w:szCs w:val="20"/>
-          <w:lang w:val="es-MX"/>
-        </w:rPr>
-        <w:t xml:space="preserve"> en animaciones, modelos, entorno y en </w:t>
-      </w:r>
-      <w:proofErr w:type="spellStart"/>
-      <w:r>
-        <w:rPr>
-          <w:rFonts w:ascii="DePixel" w:hAnsi="DePixel"/>
-          <w:sz w:val="20"/>
-          <w:szCs w:val="20"/>
-          <w:lang w:val="es-MX"/>
-        </w:rPr>
-        <w:t>codigo</w:t>
-      </w:r>
-      <w:proofErr w:type="spellEnd"/>
-      <w:r>
-        <w:rPr>
-          <w:rFonts w:ascii="DePixel" w:hAnsi="DePixel"/>
-          <w:sz w:val="20"/>
-          <w:szCs w:val="20"/>
-          <w:lang w:val="es-MX"/>
-        </w:rPr>
-        <w:t>.</w:t>
-      </w:r>
-    </w:p>
-    <w:p>
-      <w:pPr>
-        <w:rPr>
-          <w:rFonts w:ascii="DePixel" w:hAnsi="DePixel"/>
-          <w:sz w:val="20"/>
-          <w:szCs w:val="20"/>
-          <w:lang w:val="es-MX"/>
-        </w:rPr>
-      </w:pPr>
-      <w:r>
-        <w:rPr>
-          <w:rFonts w:ascii="DePixel" w:hAnsi="DePixel"/>
-          <w:sz w:val="20"/>
-          <w:szCs w:val="20"/>
-          <w:lang w:val="es-MX"/>
-        </w:rPr>
-        <w:t>Meter material para lore repartido por el mapa.</w:t>
-      </w:r>
-    </w:p>
-    <w:p>
-      <w:pPr>
-        <w:rPr>
-          <w:rFonts w:ascii="DePixel" w:hAnsi="DePixel"/>
-          <w:sz w:val="20"/>
-          <w:szCs w:val="20"/>
-          <w:lang w:val="es-MX"/>
-        </w:rPr>
-      </w:pPr>
-      <w:r>
-        <w:rPr>
-          <w:rFonts w:ascii="DePixel" w:hAnsi="DePixel"/>
-          <w:sz w:val="20"/>
-          <w:szCs w:val="20"/>
-          <w:lang w:val="es-MX"/>
-        </w:rPr>
-        <w:t xml:space="preserve">Y agregar mas decoraciones para darle vida. </w:t>
-      </w:r>
-    </w:p>
-    <w:p>
-      <w:pPr>
-        <w:rPr>
-          <w:rFonts w:ascii="DePixel" w:hAnsi="DePixel"/>
-          <w:sz w:val="20"/>
-          <w:szCs w:val="20"/>
-          <w:lang w:val="es-MX"/>
-        </w:rPr>
-      </w:pPr>
-    </w:p>
-    <w:p>
-      <w:pPr>
-        <w:rPr>
-          <w:rFonts w:ascii="DePixel" w:hAnsi="DePixel"/>
-          <w:sz w:val="20"/>
-          <w:szCs w:val="20"/>
-          <w:lang w:val="es-MX"/>
-        </w:rPr>
-      </w:pPr>
-    </w:p>
-    <w:p>
-      <w:pPr>
-        <w:rPr>
-          <w:rFonts w:ascii="DePixel" w:hAnsi="DePixel"/>
-          <w:sz w:val="20"/>
-          <w:szCs w:val="20"/>
-          <w:lang w:val="es-MX"/>
-        </w:rPr>
-      </w:pPr>
-    </w:p>
-    <w:p>
-      <w:pPr>
-        <w:rPr>
-          <w:rFonts w:ascii="DePixel" w:hAnsi="DePixel"/>
-          <w:sz w:val="20"/>
-          <w:szCs w:val="20"/>
-          <w:lang w:val="es-MX"/>
-        </w:rPr>
-      </w:pPr>
-    </w:p>
-    <w:p>
-      <w:pPr>
-        <w:rPr>
-          <w:rFonts w:ascii="DePixel" w:hAnsi="DePixel"/>
-          <w:sz w:val="20"/>
-          <w:szCs w:val="20"/>
-          <w:lang w:val="es-MX"/>
-        </w:rPr>
-      </w:pPr>
-    </w:p>
-    <w:p>
-      <w:pPr>
+        <w:pStyle w:val="Ttulo1"/>
         <w:jc w:val="center"/>
         <w:rPr>
-          <w:rFonts w:ascii="DePixel" w:eastAsiaTheme="majorEastAsia" w:hAnsi="DePixel" w:cstheme="majorBidi"/>
-          <w:b/>
-          <w:bCs/>
+          <w:rFonts w:ascii="Pixel" w:hAnsi="Pixel"/>
           <w:color w:val="000000" w:themeColor="text1"/>
-          <w:sz w:val="28"/>
-          <w:szCs w:val="28"/>
           <w:lang w:val="es-MX"/>
           <w14:textOutline w14:w="9525" w14:cap="rnd" w14:cmpd="sng" w14:algn="ctr">
             <w14:solidFill>
@@ -3754,13 +4812,8 @@
       </w:pPr>
       <w:r>
         <w:rPr>
-          <w:rFonts w:ascii="DePixel" w:eastAsiaTheme="majorEastAsia" w:hAnsi="DePixel" w:cstheme="majorBidi"/>
-          <w:b/>
-          <w:bCs/>
-          <w:noProof/>
+          <w:rFonts w:ascii="Pixel" w:hAnsi="Pixel"/>
           <w:color w:val="000000" w:themeColor="text1"/>
-          <w:sz w:val="28"/>
-          <w:szCs w:val="28"/>
           <w:lang w:val="es-MX"/>
           <w14:textOutline w14:w="9525" w14:cap="rnd" w14:cmpd="sng" w14:algn="ctr">
             <w14:solidFill>
@@ -3770,14 +4823,1330 @@
             <w14:bevel/>
           </w14:textOutline>
         </w:rPr>
+        <w:t>1</w:t>
+      </w:r>
+      <w:r>
+        <w:rPr>
+          <w:rFonts w:ascii="Pixel" w:hAnsi="Pixel"/>
+          <w:color w:val="000000" w:themeColor="text1"/>
+          <w:lang w:val="es-MX"/>
+          <w14:textOutline w14:w="9525" w14:cap="rnd" w14:cmpd="sng" w14:algn="ctr">
+            <w14:solidFill>
+              <w14:srgbClr w14:val="92D050"/>
+            </w14:solidFill>
+            <w14:prstDash w14:val="solid"/>
+            <w14:bevel/>
+          </w14:textOutline>
+        </w:rPr>
+        <w:t>4</w:t>
+      </w:r>
+      <w:r>
+        <w:rPr>
+          <w:rFonts w:ascii="Pixel" w:hAnsi="Pixel"/>
+          <w:color w:val="000000" w:themeColor="text1"/>
+          <w:lang w:val="es-MX"/>
+          <w14:textOutline w14:w="9525" w14:cap="rnd" w14:cmpd="sng" w14:algn="ctr">
+            <w14:solidFill>
+              <w14:srgbClr w14:val="92D050"/>
+            </w14:solidFill>
+            <w14:prstDash w14:val="solid"/>
+            <w14:bevel/>
+          </w14:textOutline>
+        </w:rPr>
+        <w:t>. Historia (resumen)</w:t>
+      </w:r>
+    </w:p>
+    <w:p>
+      <w:pPr>
+        <w:rPr>
+          <w:rFonts w:ascii="DePixel" w:hAnsi="DePixel"/>
+          <w:sz w:val="20"/>
+          <w:szCs w:val="20"/>
+          <w:lang w:val="es-MX"/>
+        </w:rPr>
+      </w:pPr>
+      <w:r>
+        <w:rPr>
+          <w:rFonts w:ascii="DePixel" w:hAnsi="DePixel"/>
+          <w:sz w:val="20"/>
+          <w:szCs w:val="20"/>
+          <w:lang w:val="es-MX"/>
+        </w:rPr>
+        <w:t>En un universo alterno, tras romperse acuerdos internacionales y escalar tensiones entre potencias, una guerra global impulsa proyectos experimentales. México participa como aliado estratégico con infraestructura y un laboratorio fuera de la Ciudad de México, supervisado por agentes de Estados Unidos, enfocado en tecnología</w:t>
+      </w:r>
+      <w:r>
+        <w:rPr>
+          <w:rFonts w:ascii="DePixel" w:hAnsi="DePixel"/>
+          <w:sz w:val="20"/>
+          <w:szCs w:val="20"/>
+          <w:lang w:val="es-MX"/>
+        </w:rPr>
+        <w:t xml:space="preserve"> de realidad virtual, redes neuronales para estimular el cerebro, y campos digitales para mejorar las habilidades, entrenar planes e incluso en ese </w:t>
+      </w:r>
+      <w:r>
+        <w:rPr>
+          <w:rFonts w:ascii="DePixel" w:hAnsi="DePixel"/>
+          <w:sz w:val="20"/>
+          <w:szCs w:val="20"/>
+          <w:lang w:val="es-MX"/>
+        </w:rPr>
+        <w:lastRenderedPageBreak/>
+        <w:t xml:space="preserve">sistema crear escenarios o recreaciones completas para memorizar y que los soldados aprendan a ejecutar una misión al 100%. Esta tecnología seria desarrollada por 3 científicos de software, y el que cobrara notoriedad será alguien que se topara con nuestros protagonistas en el futuro, pero no será “el” como tal. Después de que haya pasado la terrible guerra global, el proyecto que tanto habían invertido los 3 </w:t>
+      </w:r>
+      <w:r>
+        <w:rPr>
+          <w:rFonts w:ascii="DePixel" w:hAnsi="DePixel"/>
+          <w:sz w:val="20"/>
+          <w:szCs w:val="20"/>
+          <w:lang w:val="es-MX"/>
+        </w:rPr>
+        <w:t>científicos</w:t>
+      </w:r>
+      <w:r>
+        <w:rPr>
+          <w:rFonts w:ascii="DePixel" w:hAnsi="DePixel"/>
+          <w:sz w:val="20"/>
+          <w:szCs w:val="20"/>
+          <w:lang w:val="es-MX"/>
+        </w:rPr>
+        <w:t xml:space="preserve"> con tiempo, sería recordado como </w:t>
+      </w:r>
+      <w:proofErr w:type="gramStart"/>
+      <w:r>
+        <w:rPr>
+          <w:rFonts w:ascii="DePixel" w:hAnsi="DePixel"/>
+          <w:sz w:val="20"/>
+          <w:szCs w:val="20"/>
+          <w:lang w:val="es-MX"/>
+        </w:rPr>
+        <w:t>reliquia</w:t>
+      </w:r>
+      <w:proofErr w:type="gramEnd"/>
+      <w:r>
+        <w:rPr>
+          <w:rFonts w:ascii="DePixel" w:hAnsi="DePixel"/>
+          <w:sz w:val="20"/>
+          <w:szCs w:val="20"/>
+          <w:lang w:val="es-MX"/>
+        </w:rPr>
+        <w:t xml:space="preserve"> pero abandonada en el mismo lugar, ya que empresas multimillonarias harían sus propias versiones para el entretenimiento. Sin embargo, la primera </w:t>
+      </w:r>
+      <w:r>
+        <w:rPr>
+          <w:rFonts w:ascii="DePixel" w:hAnsi="DePixel"/>
+          <w:sz w:val="20"/>
+          <w:szCs w:val="20"/>
+          <w:lang w:val="es-MX"/>
+        </w:rPr>
+        <w:t>máquina</w:t>
+      </w:r>
+      <w:r>
+        <w:rPr>
+          <w:rFonts w:ascii="DePixel" w:hAnsi="DePixel"/>
+          <w:sz w:val="20"/>
+          <w:szCs w:val="20"/>
+          <w:lang w:val="es-MX"/>
+        </w:rPr>
+        <w:t xml:space="preserve"> virtual</w:t>
+      </w:r>
+      <w:r>
+        <w:rPr>
+          <w:rFonts w:ascii="DePixel" w:hAnsi="DePixel"/>
+          <w:sz w:val="20"/>
+          <w:szCs w:val="20"/>
+          <w:lang w:val="es-MX"/>
+        </w:rPr>
+        <w:t xml:space="preserve"> </w:t>
+      </w:r>
+      <w:proofErr w:type="spellStart"/>
+      <w:r>
+        <w:rPr>
+          <w:rFonts w:ascii="DePixel" w:hAnsi="DePixel"/>
+          <w:sz w:val="20"/>
+          <w:szCs w:val="20"/>
+          <w:lang w:val="es-MX"/>
+        </w:rPr>
+        <w:t>tenia</w:t>
+      </w:r>
+      <w:proofErr w:type="spellEnd"/>
+      <w:r>
+        <w:rPr>
+          <w:rFonts w:ascii="DePixel" w:hAnsi="DePixel"/>
+          <w:sz w:val="20"/>
+          <w:szCs w:val="20"/>
+          <w:lang w:val="es-MX"/>
+        </w:rPr>
+        <w:t xml:space="preserve"> un agente de IA que era igual de humano que uno de carne, condenado a estar eternamente solo buscaría la forma de escapar, pasando así mucho tiempo, hasta que unos jóvenes entran por accidente a su mundo. Dando así el comienzo del juego. </w:t>
+      </w:r>
+      <w:r>
+        <w:rPr>
+          <w:rFonts w:ascii="DePixel" w:hAnsi="DePixel"/>
+          <w:sz w:val="20"/>
+          <w:szCs w:val="20"/>
+          <w:lang w:val="es-MX"/>
+        </w:rPr>
+        <w:t xml:space="preserve"> </w:t>
+      </w:r>
+    </w:p>
+    <w:p>
+      <w:pPr>
+        <w:pStyle w:val="Ttulo1"/>
+        <w:jc w:val="center"/>
+        <w:rPr>
+          <w:rFonts w:ascii="Pixel" w:hAnsi="Pixel"/>
+          <w:color w:val="000000" w:themeColor="text1"/>
+          <w:lang w:val="es-MX"/>
+          <w14:textOutline w14:w="9525" w14:cap="rnd" w14:cmpd="sng" w14:algn="ctr">
+            <w14:solidFill>
+              <w14:srgbClr w14:val="92D050"/>
+            </w14:solidFill>
+            <w14:prstDash w14:val="solid"/>
+            <w14:bevel/>
+          </w14:textOutline>
+        </w:rPr>
+      </w:pPr>
+      <w:r>
+        <w:rPr>
+          <w:rFonts w:ascii="Pixel" w:hAnsi="Pixel"/>
+          <w:color w:val="000000" w:themeColor="text1"/>
+          <w:lang w:val="es-MX"/>
+          <w14:textOutline w14:w="9525" w14:cap="rnd" w14:cmpd="sng" w14:algn="ctr">
+            <w14:solidFill>
+              <w14:srgbClr w14:val="92D050"/>
+            </w14:solidFill>
+            <w14:prstDash w14:val="solid"/>
+            <w14:bevel/>
+          </w14:textOutline>
+        </w:rPr>
+        <w:t>1</w:t>
+      </w:r>
+      <w:r>
+        <w:rPr>
+          <w:rFonts w:ascii="Pixel" w:hAnsi="Pixel"/>
+          <w:color w:val="000000" w:themeColor="text1"/>
+          <w:lang w:val="es-MX"/>
+          <w14:textOutline w14:w="9525" w14:cap="rnd" w14:cmpd="sng" w14:algn="ctr">
+            <w14:solidFill>
+              <w14:srgbClr w14:val="92D050"/>
+            </w14:solidFill>
+            <w14:prstDash w14:val="solid"/>
+            <w14:bevel/>
+          </w14:textOutline>
+        </w:rPr>
+        <w:t>4</w:t>
+      </w:r>
+      <w:r>
+        <w:rPr>
+          <w:rFonts w:ascii="Pixel" w:hAnsi="Pixel"/>
+          <w:color w:val="000000" w:themeColor="text1"/>
+          <w:lang w:val="es-MX"/>
+          <w14:textOutline w14:w="9525" w14:cap="rnd" w14:cmpd="sng" w14:algn="ctr">
+            <w14:solidFill>
+              <w14:srgbClr w14:val="92D050"/>
+            </w14:solidFill>
+            <w14:prstDash w14:val="solid"/>
+            <w14:bevel/>
+          </w14:textOutline>
+        </w:rPr>
+        <w:t xml:space="preserve">. </w:t>
+      </w:r>
+      <w:proofErr w:type="spellStart"/>
+      <w:r>
+        <w:rPr>
+          <w:rFonts w:ascii="Pixel" w:hAnsi="Pixel"/>
+          <w:color w:val="000000" w:themeColor="text1"/>
+          <w:lang w:val="es-MX"/>
+          <w14:textOutline w14:w="9525" w14:cap="rnd" w14:cmpd="sng" w14:algn="ctr">
+            <w14:solidFill>
+              <w14:srgbClr w14:val="92D050"/>
+            </w14:solidFill>
+            <w14:prstDash w14:val="solid"/>
+            <w14:bevel/>
+          </w14:textOutline>
+        </w:rPr>
+        <w:t>Roadmap</w:t>
+      </w:r>
+      <w:proofErr w:type="spellEnd"/>
+      <w:r>
+        <w:rPr>
+          <w:rFonts w:ascii="Pixel" w:hAnsi="Pixel"/>
+          <w:color w:val="000000" w:themeColor="text1"/>
+          <w:lang w:val="es-MX"/>
+          <w14:textOutline w14:w="9525" w14:cap="rnd" w14:cmpd="sng" w14:algn="ctr">
+            <w14:solidFill>
+              <w14:srgbClr w14:val="92D050"/>
+            </w14:solidFill>
+            <w14:prstDash w14:val="solid"/>
+            <w14:bevel/>
+          </w14:textOutline>
+        </w:rPr>
+        <w:t xml:space="preserve"> (propuesta por fases)</w:t>
+      </w:r>
+    </w:p>
+    <w:p>
+      <w:pPr>
+        <w:rPr>
+          <w:rFonts w:ascii="DePixel" w:hAnsi="DePixel"/>
+          <w:b/>
+          <w:bCs/>
+          <w:i/>
+          <w:iCs/>
+          <w:sz w:val="20"/>
+          <w:szCs w:val="20"/>
+          <w:u w:val="single"/>
+          <w:lang w:val="es-MX"/>
+        </w:rPr>
+      </w:pPr>
+      <w:r>
+        <w:rPr>
+          <w:rFonts w:ascii="DePixel" w:hAnsi="DePixel"/>
+          <w:b/>
+          <w:bCs/>
+          <w:i/>
+          <w:iCs/>
+          <w:sz w:val="20"/>
+          <w:szCs w:val="20"/>
+          <w:u w:val="single"/>
+          <w:lang w:val="es-MX"/>
+        </w:rPr>
+        <w:t xml:space="preserve">Fase 1 - Prototipo del </w:t>
+      </w:r>
+      <w:proofErr w:type="spellStart"/>
+      <w:r>
+        <w:rPr>
+          <w:rFonts w:ascii="DePixel" w:hAnsi="DePixel"/>
+          <w:b/>
+          <w:bCs/>
+          <w:i/>
+          <w:iCs/>
+          <w:sz w:val="20"/>
+          <w:szCs w:val="20"/>
+          <w:u w:val="single"/>
+          <w:lang w:val="es-MX"/>
+        </w:rPr>
+        <w:t>core</w:t>
+      </w:r>
+      <w:proofErr w:type="spellEnd"/>
+      <w:r>
+        <w:rPr>
+          <w:rFonts w:ascii="DePixel" w:hAnsi="DePixel"/>
+          <w:b/>
+          <w:bCs/>
+          <w:i/>
+          <w:iCs/>
+          <w:sz w:val="20"/>
+          <w:szCs w:val="20"/>
+          <w:u w:val="single"/>
+          <w:lang w:val="es-MX"/>
+        </w:rPr>
+        <w:t xml:space="preserve"> (2 semanas):</w:t>
+      </w:r>
+    </w:p>
+    <w:p>
+      <w:pPr>
+        <w:rPr>
+          <w:rFonts w:ascii="DePixel" w:hAnsi="DePixel"/>
+          <w:sz w:val="20"/>
+          <w:szCs w:val="20"/>
+          <w:lang w:val="es-MX"/>
+        </w:rPr>
+      </w:pPr>
+      <w:r>
+        <w:rPr>
+          <w:rFonts w:ascii="DePixel" w:hAnsi="DePixel"/>
+          <w:sz w:val="20"/>
+          <w:szCs w:val="20"/>
+          <w:lang w:val="es-MX"/>
+        </w:rPr>
+        <w:t xml:space="preserve">Movimiento, interacción y recolección de </w:t>
+      </w:r>
+      <w:proofErr w:type="spellStart"/>
+      <w:r>
+        <w:rPr>
+          <w:rFonts w:ascii="DePixel" w:hAnsi="DePixel"/>
+          <w:sz w:val="20"/>
+          <w:szCs w:val="20"/>
+          <w:lang w:val="es-MX"/>
+        </w:rPr>
+        <w:t>loot</w:t>
+      </w:r>
+      <w:proofErr w:type="spellEnd"/>
+      <w:r>
+        <w:rPr>
+          <w:rFonts w:ascii="DePixel" w:hAnsi="DePixel"/>
+          <w:sz w:val="20"/>
+          <w:szCs w:val="20"/>
+          <w:lang w:val="es-MX"/>
+        </w:rPr>
+        <w:t>.</w:t>
+      </w:r>
+    </w:p>
+    <w:p>
+      <w:pPr>
+        <w:rPr>
+          <w:rFonts w:ascii="DePixel" w:hAnsi="DePixel"/>
+          <w:sz w:val="20"/>
+          <w:szCs w:val="20"/>
+          <w:lang w:val="es-MX"/>
+        </w:rPr>
+      </w:pPr>
+      <w:r>
+        <w:rPr>
+          <w:rFonts w:ascii="DePixel" w:hAnsi="DePixel"/>
+          <w:sz w:val="20"/>
+          <w:szCs w:val="20"/>
+          <w:lang w:val="es-MX"/>
+        </w:rPr>
+        <w:t>1 criatura con comportamiento básico (patrulla + persecución).</w:t>
+      </w:r>
+    </w:p>
+    <w:p>
+      <w:pPr>
+        <w:rPr>
+          <w:rFonts w:ascii="DePixel" w:hAnsi="DePixel"/>
+          <w:sz w:val="20"/>
+          <w:szCs w:val="20"/>
+          <w:lang w:val="es-MX"/>
+        </w:rPr>
+      </w:pPr>
+      <w:r>
+        <w:rPr>
+          <w:rFonts w:ascii="DePixel" w:hAnsi="DePixel"/>
+          <w:sz w:val="20"/>
+          <w:szCs w:val="20"/>
+          <w:lang w:val="es-MX"/>
+        </w:rPr>
+        <w:t>Extracción funcional y economía mínima.</w:t>
+      </w:r>
+    </w:p>
+    <w:p>
+      <w:pPr>
+        <w:rPr>
+          <w:rFonts w:ascii="DePixel" w:hAnsi="DePixel"/>
+          <w:sz w:val="20"/>
+          <w:szCs w:val="20"/>
+          <w:lang w:val="es-MX"/>
+        </w:rPr>
+      </w:pPr>
+      <w:r>
+        <w:rPr>
+          <w:rFonts w:ascii="DePixel" w:hAnsi="DePixel"/>
+          <w:sz w:val="20"/>
+          <w:szCs w:val="20"/>
+          <w:lang w:val="es-MX"/>
+        </w:rPr>
+        <w:t xml:space="preserve">Mapa base para ver </w:t>
+      </w:r>
+      <w:r>
+        <w:rPr>
+          <w:rFonts w:ascii="DePixel" w:hAnsi="DePixel"/>
+          <w:sz w:val="20"/>
+          <w:szCs w:val="20"/>
+          <w:lang w:val="es-MX"/>
+        </w:rPr>
+        <w:t xml:space="preserve">las interacciones del jugador y enemigo en el ambiente. </w:t>
+      </w:r>
+    </w:p>
+    <w:p>
+      <w:pPr>
+        <w:rPr>
+          <w:rFonts w:ascii="DePixel" w:hAnsi="DePixel"/>
+          <w:b/>
+          <w:bCs/>
+          <w:i/>
+          <w:iCs/>
+          <w:sz w:val="20"/>
+          <w:szCs w:val="20"/>
+          <w:u w:val="single"/>
+          <w:lang w:val="es-MX"/>
+        </w:rPr>
+      </w:pPr>
+      <w:r>
+        <w:rPr>
+          <w:rFonts w:ascii="DePixel" w:hAnsi="DePixel"/>
+          <w:b/>
+          <w:bCs/>
+          <w:i/>
+          <w:iCs/>
+          <w:sz w:val="20"/>
+          <w:szCs w:val="20"/>
+          <w:u w:val="single"/>
+          <w:lang w:val="es-MX"/>
+        </w:rPr>
+        <w:t>Fase 2 - MVP jugable (</w:t>
+      </w:r>
+      <w:r>
+        <w:rPr>
+          <w:rFonts w:ascii="DePixel" w:hAnsi="DePixel"/>
+          <w:b/>
+          <w:bCs/>
+          <w:i/>
+          <w:iCs/>
+          <w:sz w:val="20"/>
+          <w:szCs w:val="20"/>
+          <w:u w:val="single"/>
+          <w:lang w:val="es-MX"/>
+        </w:rPr>
+        <w:t>2-4</w:t>
+      </w:r>
+      <w:r>
+        <w:rPr>
+          <w:rFonts w:ascii="DePixel" w:hAnsi="DePixel"/>
+          <w:b/>
+          <w:bCs/>
+          <w:i/>
+          <w:iCs/>
+          <w:sz w:val="20"/>
+          <w:szCs w:val="20"/>
+          <w:u w:val="single"/>
+          <w:lang w:val="es-MX"/>
+        </w:rPr>
+        <w:t xml:space="preserve"> semanas):</w:t>
+      </w:r>
+    </w:p>
+    <w:p>
+      <w:pPr>
+        <w:rPr>
+          <w:rFonts w:ascii="DePixel" w:hAnsi="DePixel"/>
+          <w:sz w:val="20"/>
+          <w:szCs w:val="20"/>
+          <w:lang w:val="es-MX"/>
+        </w:rPr>
+      </w:pPr>
+      <w:r>
+        <w:rPr>
+          <w:rFonts w:ascii="DePixel" w:hAnsi="DePixel"/>
+          <w:sz w:val="20"/>
+          <w:szCs w:val="20"/>
+          <w:lang w:val="es-MX"/>
+        </w:rPr>
+        <w:t xml:space="preserve">Mapa </w:t>
+      </w:r>
+      <w:r>
+        <w:rPr>
+          <w:rFonts w:ascii="DePixel" w:hAnsi="DePixel"/>
+          <w:sz w:val="20"/>
+          <w:szCs w:val="20"/>
+          <w:lang w:val="es-MX"/>
+        </w:rPr>
+        <w:t xml:space="preserve">completamente terminado </w:t>
+      </w:r>
+    </w:p>
+    <w:p>
+      <w:pPr>
+        <w:rPr>
+          <w:rFonts w:ascii="DePixel" w:hAnsi="DePixel"/>
+          <w:sz w:val="20"/>
+          <w:szCs w:val="20"/>
+          <w:lang w:val="es-MX"/>
+        </w:rPr>
+      </w:pPr>
+      <w:r>
+        <w:rPr>
+          <w:rFonts w:ascii="DePixel" w:hAnsi="DePixel"/>
+          <w:sz w:val="20"/>
+          <w:szCs w:val="20"/>
+          <w:lang w:val="es-MX"/>
+        </w:rPr>
+        <w:t>3 criaturas y balance inicial.</w:t>
+      </w:r>
+    </w:p>
+    <w:p>
+      <w:pPr>
+        <w:rPr>
+          <w:rFonts w:ascii="DePixel" w:hAnsi="DePixel"/>
+          <w:sz w:val="20"/>
+          <w:szCs w:val="20"/>
+          <w:lang w:val="es-MX"/>
+        </w:rPr>
+      </w:pPr>
+      <w:r>
+        <w:rPr>
+          <w:rFonts w:ascii="DePixel" w:hAnsi="DePixel"/>
+          <w:sz w:val="20"/>
+          <w:szCs w:val="20"/>
+          <w:lang w:val="es-MX"/>
+        </w:rPr>
+        <w:t>Herramientas (trampa</w:t>
+      </w:r>
+      <w:r>
+        <w:rPr>
+          <w:rFonts w:ascii="DePixel" w:hAnsi="DePixel"/>
+          <w:sz w:val="20"/>
+          <w:szCs w:val="20"/>
+          <w:lang w:val="es-MX"/>
+        </w:rPr>
+        <w:t xml:space="preserve"> enemigos</w:t>
+      </w:r>
+      <w:r>
+        <w:rPr>
+          <w:rFonts w:ascii="DePixel" w:hAnsi="DePixel"/>
+          <w:sz w:val="20"/>
+          <w:szCs w:val="20"/>
+          <w:lang w:val="es-MX"/>
+        </w:rPr>
+        <w:t>/aturdidor</w:t>
+      </w:r>
+      <w:r>
+        <w:rPr>
+          <w:rFonts w:ascii="DePixel" w:hAnsi="DePixel"/>
+          <w:sz w:val="20"/>
+          <w:szCs w:val="20"/>
+          <w:lang w:val="es-MX"/>
+        </w:rPr>
+        <w:t xml:space="preserve"> para enemigos</w:t>
+      </w:r>
+      <w:r>
+        <w:rPr>
+          <w:rFonts w:ascii="DePixel" w:hAnsi="DePixel"/>
+          <w:sz w:val="20"/>
+          <w:szCs w:val="20"/>
+          <w:lang w:val="es-MX"/>
+        </w:rPr>
+        <w:t>/contenedor</w:t>
+      </w:r>
+      <w:r>
+        <w:rPr>
+          <w:rFonts w:ascii="DePixel" w:hAnsi="DePixel"/>
+          <w:sz w:val="20"/>
+          <w:szCs w:val="20"/>
+          <w:lang w:val="es-MX"/>
+        </w:rPr>
+        <w:t xml:space="preserve"> para enemigos</w:t>
+      </w:r>
+      <w:r>
+        <w:rPr>
+          <w:rFonts w:ascii="DePixel" w:hAnsi="DePixel"/>
+          <w:sz w:val="20"/>
+          <w:szCs w:val="20"/>
+          <w:lang w:val="es-MX"/>
+        </w:rPr>
+        <w:t xml:space="preserve">) </w:t>
+      </w:r>
+    </w:p>
+    <w:p>
+      <w:pPr>
+        <w:rPr>
+          <w:rFonts w:ascii="DePixel" w:hAnsi="DePixel"/>
+          <w:sz w:val="20"/>
+          <w:szCs w:val="20"/>
+          <w:lang w:val="es-MX"/>
+        </w:rPr>
+      </w:pPr>
+      <w:r>
+        <w:rPr>
+          <w:rFonts w:ascii="DePixel" w:hAnsi="DePixel"/>
+          <w:sz w:val="20"/>
+          <w:szCs w:val="20"/>
+          <w:lang w:val="es-MX"/>
+        </w:rPr>
+        <w:t>-</w:t>
+      </w:r>
+      <w:r>
+        <w:rPr>
+          <w:rFonts w:ascii="DePixel" w:hAnsi="DePixel"/>
+          <w:sz w:val="20"/>
+          <w:szCs w:val="20"/>
+          <w:lang w:val="es-MX"/>
+        </w:rPr>
+        <w:t xml:space="preserve"> UI mínima</w:t>
+      </w:r>
+    </w:p>
+    <w:p>
+      <w:pPr>
+        <w:rPr>
+          <w:rFonts w:ascii="DePixel" w:hAnsi="DePixel"/>
+          <w:b/>
+          <w:bCs/>
+          <w:i/>
+          <w:iCs/>
+          <w:sz w:val="20"/>
+          <w:szCs w:val="20"/>
+          <w:u w:val="single"/>
+          <w:lang w:val="es-MX"/>
+        </w:rPr>
+      </w:pPr>
+      <w:r>
+        <w:rPr>
+          <w:rFonts w:ascii="DePixel" w:hAnsi="DePixel"/>
+          <w:b/>
+          <w:bCs/>
+          <w:i/>
+          <w:iCs/>
+          <w:sz w:val="20"/>
+          <w:szCs w:val="20"/>
+          <w:u w:val="single"/>
+          <w:lang w:val="es-MX"/>
+        </w:rPr>
+        <w:t xml:space="preserve">Fase 3 - </w:t>
+      </w:r>
+      <w:r>
+        <w:rPr>
+          <w:rFonts w:ascii="DePixel" w:hAnsi="DePixel"/>
+          <w:b/>
+          <w:bCs/>
+          <w:i/>
+          <w:iCs/>
+          <w:sz w:val="20"/>
+          <w:szCs w:val="20"/>
+          <w:u w:val="single"/>
+          <w:lang w:val="es-MX"/>
+        </w:rPr>
+        <w:t>Optimización</w:t>
+      </w:r>
+      <w:r>
+        <w:rPr>
+          <w:rFonts w:ascii="DePixel" w:hAnsi="DePixel"/>
+          <w:b/>
+          <w:bCs/>
+          <w:i/>
+          <w:iCs/>
+          <w:sz w:val="20"/>
+          <w:szCs w:val="20"/>
+          <w:u w:val="single"/>
+          <w:lang w:val="es-MX"/>
+        </w:rPr>
+        <w:t xml:space="preserve"> (4-</w:t>
+      </w:r>
+      <w:r>
+        <w:rPr>
+          <w:rFonts w:ascii="DePixel" w:hAnsi="DePixel"/>
+          <w:b/>
+          <w:bCs/>
+          <w:i/>
+          <w:iCs/>
+          <w:sz w:val="20"/>
+          <w:szCs w:val="20"/>
+          <w:u w:val="single"/>
+          <w:lang w:val="es-MX"/>
+        </w:rPr>
+        <w:t>5</w:t>
+      </w:r>
+      <w:r>
+        <w:rPr>
+          <w:rFonts w:ascii="DePixel" w:hAnsi="DePixel"/>
+          <w:b/>
+          <w:bCs/>
+          <w:i/>
+          <w:iCs/>
+          <w:sz w:val="20"/>
+          <w:szCs w:val="20"/>
+          <w:u w:val="single"/>
+          <w:lang w:val="es-MX"/>
+        </w:rPr>
+        <w:t xml:space="preserve"> semanas):</w:t>
+      </w:r>
+    </w:p>
+    <w:p>
+      <w:pPr>
+        <w:rPr>
+          <w:rFonts w:ascii="DePixel" w:hAnsi="DePixel"/>
+          <w:sz w:val="20"/>
+          <w:szCs w:val="20"/>
+          <w:lang w:val="es-MX"/>
+        </w:rPr>
+      </w:pPr>
+      <w:r>
+        <w:rPr>
+          <w:rFonts w:ascii="DePixel" w:hAnsi="DePixel"/>
+          <w:sz w:val="20"/>
+          <w:szCs w:val="20"/>
+          <w:lang w:val="es-MX"/>
+        </w:rPr>
+        <w:t xml:space="preserve">Pulido de atmósfera (audio, iluminación, </w:t>
+      </w:r>
+      <w:proofErr w:type="spellStart"/>
+      <w:r>
+        <w:rPr>
+          <w:rFonts w:ascii="DePixel" w:hAnsi="DePixel"/>
+          <w:sz w:val="20"/>
+          <w:szCs w:val="20"/>
+          <w:lang w:val="es-MX"/>
+        </w:rPr>
+        <w:t>feedback</w:t>
+      </w:r>
+      <w:proofErr w:type="spellEnd"/>
+      <w:r>
+        <w:rPr>
+          <w:rFonts w:ascii="DePixel" w:hAnsi="DePixel"/>
+          <w:sz w:val="20"/>
+          <w:szCs w:val="20"/>
+          <w:lang w:val="es-MX"/>
+        </w:rPr>
+        <w:t>)</w:t>
+      </w:r>
+      <w:r>
+        <w:rPr>
+          <w:rFonts w:ascii="DePixel" w:hAnsi="DePixel"/>
+          <w:sz w:val="20"/>
+          <w:szCs w:val="20"/>
+          <w:lang w:val="es-MX"/>
+        </w:rPr>
+        <w:t>.</w:t>
+      </w:r>
+    </w:p>
+    <w:p>
+      <w:pPr>
+        <w:rPr>
+          <w:rFonts w:ascii="DePixel" w:hAnsi="DePixel"/>
+          <w:sz w:val="20"/>
+          <w:szCs w:val="20"/>
+          <w:lang w:val="es-MX"/>
+        </w:rPr>
+      </w:pPr>
+      <w:r>
+        <w:rPr>
+          <w:rFonts w:ascii="DePixel" w:hAnsi="DePixel"/>
+          <w:sz w:val="20"/>
+          <w:szCs w:val="20"/>
+          <w:lang w:val="es-MX"/>
+        </w:rPr>
+        <w:t>Optimización</w:t>
+      </w:r>
+      <w:r>
+        <w:rPr>
+          <w:rFonts w:ascii="DePixel" w:hAnsi="DePixel"/>
+          <w:sz w:val="20"/>
+          <w:szCs w:val="20"/>
+          <w:lang w:val="es-MX"/>
+        </w:rPr>
+        <w:t xml:space="preserve"> en animaciones, modelos, entorno y en </w:t>
+      </w:r>
+      <w:proofErr w:type="spellStart"/>
+      <w:r>
+        <w:rPr>
+          <w:rFonts w:ascii="DePixel" w:hAnsi="DePixel"/>
+          <w:sz w:val="20"/>
+          <w:szCs w:val="20"/>
+          <w:lang w:val="es-MX"/>
+        </w:rPr>
+        <w:t>codigo</w:t>
+      </w:r>
+      <w:proofErr w:type="spellEnd"/>
+      <w:r>
+        <w:rPr>
+          <w:rFonts w:ascii="DePixel" w:hAnsi="DePixel"/>
+          <w:sz w:val="20"/>
+          <w:szCs w:val="20"/>
+          <w:lang w:val="es-MX"/>
+        </w:rPr>
+        <w:t>.</w:t>
+      </w:r>
+    </w:p>
+    <w:p>
+      <w:pPr>
+        <w:rPr>
+          <w:rFonts w:ascii="DePixel" w:hAnsi="DePixel"/>
+          <w:sz w:val="20"/>
+          <w:szCs w:val="20"/>
+          <w:lang w:val="es-MX"/>
+        </w:rPr>
+      </w:pPr>
+      <w:r>
+        <w:rPr>
+          <w:rFonts w:ascii="DePixel" w:hAnsi="DePixel"/>
+          <w:sz w:val="20"/>
+          <w:szCs w:val="20"/>
+          <w:lang w:val="es-MX"/>
+        </w:rPr>
+        <w:t>Meter material para lore repartido por el mapa</w:t>
+      </w:r>
+      <w:r>
+        <w:rPr>
+          <w:rFonts w:ascii="DePixel" w:hAnsi="DePixel"/>
+          <w:sz w:val="20"/>
+          <w:szCs w:val="20"/>
+          <w:lang w:val="es-MX"/>
+        </w:rPr>
+        <w:t>:</w:t>
+      </w:r>
+    </w:p>
+    <w:p>
+      <w:pPr>
+        <w:rPr>
+          <w:rFonts w:ascii="DePixel" w:hAnsi="DePixel"/>
+          <w:sz w:val="20"/>
+          <w:szCs w:val="20"/>
+          <w:lang w:val="es-MX"/>
+        </w:rPr>
+      </w:pPr>
+      <w:r>
+        <w:rPr>
+          <w:rFonts w:ascii="DePixel" w:hAnsi="DePixel"/>
+          <w:sz w:val="20"/>
+          <w:szCs w:val="20"/>
+          <w:lang w:val="es-MX"/>
+        </w:rPr>
+        <w:t>-Notas</w:t>
+      </w:r>
+      <w:r>
+        <w:rPr>
+          <w:rFonts w:ascii="DePixel" w:hAnsi="DePixel"/>
+          <w:sz w:val="20"/>
+          <w:szCs w:val="20"/>
+          <w:lang w:val="es-MX"/>
+        </w:rPr>
+        <w:t xml:space="preserve"> de los propios desarrolladores comentando el desarrollo de su proyecto (en este caso de su mundo virtual)</w:t>
+      </w:r>
+      <w:r>
+        <w:rPr>
+          <w:rFonts w:ascii="DePixel" w:hAnsi="DePixel"/>
+          <w:sz w:val="20"/>
+          <w:szCs w:val="20"/>
+          <w:lang w:val="es-MX"/>
+        </w:rPr>
+        <w:t>, grabaciones</w:t>
+      </w:r>
+      <w:r>
+        <w:rPr>
+          <w:rFonts w:ascii="DePixel" w:hAnsi="DePixel"/>
+          <w:sz w:val="20"/>
+          <w:szCs w:val="20"/>
+          <w:lang w:val="es-MX"/>
+        </w:rPr>
+        <w:t xml:space="preserve"> tipo entrevistas que les hacían a los soldados</w:t>
+      </w:r>
+      <w:r>
+        <w:rPr>
+          <w:rFonts w:ascii="DePixel" w:hAnsi="DePixel"/>
+          <w:sz w:val="20"/>
+          <w:szCs w:val="20"/>
+          <w:lang w:val="es-MX"/>
+        </w:rPr>
+        <w:t xml:space="preserve">, </w:t>
+      </w:r>
+      <w:r>
+        <w:rPr>
+          <w:rFonts w:ascii="DePixel" w:hAnsi="DePixel"/>
+          <w:sz w:val="20"/>
+          <w:szCs w:val="20"/>
+          <w:lang w:val="es-MX"/>
+        </w:rPr>
+        <w:t xml:space="preserve">mensajes encriptados de la </w:t>
+      </w:r>
+      <w:r>
+        <w:rPr>
+          <w:rFonts w:ascii="DePixel" w:hAnsi="DePixel"/>
+          <w:sz w:val="20"/>
+          <w:szCs w:val="20"/>
+          <w:lang w:val="es-MX"/>
+        </w:rPr>
+        <w:lastRenderedPageBreak/>
+        <w:t xml:space="preserve">propia IA, y </w:t>
+      </w:r>
+      <w:proofErr w:type="spellStart"/>
+      <w:r>
+        <w:rPr>
+          <w:rFonts w:ascii="DePixel" w:hAnsi="DePixel"/>
+          <w:sz w:val="20"/>
+          <w:szCs w:val="20"/>
+          <w:lang w:val="es-MX"/>
+        </w:rPr>
+        <w:t>easter</w:t>
+      </w:r>
+      <w:proofErr w:type="spellEnd"/>
+      <w:r>
+        <w:rPr>
+          <w:rFonts w:ascii="DePixel" w:hAnsi="DePixel"/>
+          <w:sz w:val="20"/>
+          <w:szCs w:val="20"/>
+          <w:lang w:val="es-MX"/>
+        </w:rPr>
+        <w:t xml:space="preserve"> </w:t>
+      </w:r>
+      <w:proofErr w:type="spellStart"/>
+      <w:r>
+        <w:rPr>
+          <w:rFonts w:ascii="DePixel" w:hAnsi="DePixel"/>
+          <w:sz w:val="20"/>
+          <w:szCs w:val="20"/>
+          <w:lang w:val="es-MX"/>
+        </w:rPr>
+        <w:t>eggs</w:t>
+      </w:r>
+      <w:proofErr w:type="spellEnd"/>
+      <w:r>
+        <w:rPr>
+          <w:rFonts w:ascii="DePixel" w:hAnsi="DePixel"/>
+          <w:sz w:val="20"/>
+          <w:szCs w:val="20"/>
+          <w:lang w:val="es-MX"/>
+        </w:rPr>
+        <w:t xml:space="preserve"> ocultos que los puedes ver explorando muy a fondo el mapa</w:t>
+      </w:r>
+      <w:r>
+        <w:rPr>
+          <w:rFonts w:ascii="DePixel" w:hAnsi="DePixel"/>
+          <w:sz w:val="20"/>
+          <w:szCs w:val="20"/>
+          <w:lang w:val="es-MX"/>
+        </w:rPr>
+        <w:t>.</w:t>
+      </w:r>
+    </w:p>
+    <w:p>
+      <w:pPr>
+        <w:rPr>
+          <w:rFonts w:ascii="DePixel" w:hAnsi="DePixel"/>
+          <w:b/>
+          <w:bCs/>
+          <w:sz w:val="20"/>
+          <w:szCs w:val="20"/>
+          <w:lang w:val="es-MX"/>
+        </w:rPr>
+      </w:pPr>
+      <w:r>
+        <w:rPr>
+          <w:rFonts w:ascii="DePixel" w:hAnsi="DePixel"/>
+          <w:b/>
+          <w:bCs/>
+          <w:sz w:val="20"/>
+          <w:szCs w:val="20"/>
+          <w:lang w:val="es-MX"/>
+        </w:rPr>
+        <w:t xml:space="preserve">Y agregar </w:t>
+      </w:r>
+      <w:proofErr w:type="spellStart"/>
+      <w:r>
+        <w:rPr>
+          <w:rFonts w:ascii="DePixel" w:hAnsi="DePixel"/>
+          <w:b/>
+          <w:bCs/>
+          <w:sz w:val="20"/>
+          <w:szCs w:val="20"/>
+          <w:lang w:val="es-MX"/>
+        </w:rPr>
+        <w:t>mas</w:t>
+      </w:r>
+      <w:proofErr w:type="spellEnd"/>
+      <w:r>
+        <w:rPr>
+          <w:rFonts w:ascii="DePixel" w:hAnsi="DePixel"/>
+          <w:b/>
+          <w:bCs/>
+          <w:sz w:val="20"/>
+          <w:szCs w:val="20"/>
+          <w:lang w:val="es-MX"/>
+        </w:rPr>
+        <w:t xml:space="preserve"> decoraciones para darle vida</w:t>
+      </w:r>
+      <w:r>
+        <w:rPr>
+          <w:rFonts w:ascii="DePixel" w:hAnsi="DePixel"/>
+          <w:b/>
+          <w:bCs/>
+          <w:sz w:val="20"/>
+          <w:szCs w:val="20"/>
+          <w:lang w:val="es-MX"/>
+        </w:rPr>
+        <w:t>:</w:t>
+      </w:r>
+    </w:p>
+    <w:p>
+      <w:pPr>
+        <w:rPr>
+          <w:rFonts w:ascii="DePixel" w:hAnsi="DePixel"/>
+          <w:b/>
+          <w:bCs/>
+          <w:sz w:val="20"/>
+          <w:szCs w:val="20"/>
+          <w:lang w:val="es-MX"/>
+        </w:rPr>
+      </w:pPr>
+      <w:r>
+        <w:rPr>
+          <w:rFonts w:ascii="DePixel" w:hAnsi="DePixel"/>
+          <w:b/>
+          <w:bCs/>
+          <w:sz w:val="20"/>
+          <w:szCs w:val="20"/>
+          <w:lang w:val="es-MX"/>
+        </w:rPr>
+        <w:t xml:space="preserve"> </w:t>
+      </w:r>
+      <w:r>
+        <w:rPr>
+          <w:rFonts w:ascii="DePixel" w:hAnsi="DePixel"/>
+          <w:b/>
+          <w:bCs/>
+          <w:sz w:val="20"/>
+          <w:szCs w:val="20"/>
+          <w:lang w:val="es-MX"/>
+        </w:rPr>
+        <w:t>-</w:t>
+      </w:r>
+      <w:r>
+        <w:rPr>
+          <w:rFonts w:ascii="DePixel" w:hAnsi="DePixel"/>
+          <w:b/>
+          <w:bCs/>
+          <w:sz w:val="20"/>
+          <w:szCs w:val="20"/>
+          <w:lang w:val="es-MX"/>
+        </w:rPr>
+        <w:t xml:space="preserve">Modelos con la estética acorde como utilería de oficina, si </w:t>
+      </w:r>
+      <w:proofErr w:type="spellStart"/>
+      <w:r>
+        <w:rPr>
+          <w:rFonts w:ascii="DePixel" w:hAnsi="DePixel"/>
+          <w:b/>
+          <w:bCs/>
+          <w:sz w:val="20"/>
+          <w:szCs w:val="20"/>
+          <w:lang w:val="es-MX"/>
+        </w:rPr>
+        <w:t>esta</w:t>
+      </w:r>
+      <w:proofErr w:type="spellEnd"/>
+      <w:r>
+        <w:rPr>
+          <w:rFonts w:ascii="DePixel" w:hAnsi="DePixel"/>
+          <w:b/>
+          <w:bCs/>
+          <w:sz w:val="20"/>
+          <w:szCs w:val="20"/>
+          <w:lang w:val="es-MX"/>
+        </w:rPr>
+        <w:t xml:space="preserve"> en un cuarto como de instalaciones o de fabrica meter tubos o señalizaciones, básicamente basura decorativa</w:t>
+      </w:r>
+      <w:r>
+        <w:rPr>
+          <w:rFonts w:ascii="DePixel" w:hAnsi="DePixel"/>
+          <w:b/>
+          <w:bCs/>
+          <w:sz w:val="20"/>
+          <w:szCs w:val="20"/>
+          <w:lang w:val="es-MX"/>
+        </w:rPr>
+        <w:t>.</w:t>
+      </w:r>
+    </w:p>
+    <w:p>
+      <w:pPr>
+        <w:rPr>
+          <w:rFonts w:ascii="DePixel" w:hAnsi="DePixel"/>
+          <w:b/>
+          <w:bCs/>
+          <w:sz w:val="20"/>
+          <w:szCs w:val="20"/>
+          <w:lang w:val="es-MX"/>
+        </w:rPr>
+      </w:pPr>
+    </w:p>
+    <w:p>
+      <w:pPr>
+        <w:rPr>
+          <w:rFonts w:ascii="Pixel" w:eastAsiaTheme="majorEastAsia" w:hAnsi="Pixel" w:cstheme="majorBidi"/>
+          <w:b/>
+          <w:bCs/>
+          <w:color w:val="000000" w:themeColor="text1"/>
+          <w:sz w:val="28"/>
+          <w:szCs w:val="28"/>
+          <w:lang w:val="es-MX"/>
+          <w14:textOutline w14:w="9525" w14:cap="rnd" w14:cmpd="sng" w14:algn="ctr">
+            <w14:solidFill>
+              <w14:srgbClr w14:val="92D050"/>
+            </w14:solidFill>
+            <w14:prstDash w14:val="solid"/>
+            <w14:bevel/>
+          </w14:textOutline>
+        </w:rPr>
+      </w:pPr>
+      <w:r>
+        <w:rPr>
+          <w:rFonts w:ascii="Pixel" w:eastAsiaTheme="majorEastAsia" w:hAnsi="Pixel" w:cstheme="majorBidi"/>
+          <w:b/>
+          <w:bCs/>
+          <w:color w:val="000000" w:themeColor="text1"/>
+          <w:sz w:val="28"/>
+          <w:szCs w:val="28"/>
+          <w:lang w:val="es-MX"/>
+          <w14:textOutline w14:w="9525" w14:cap="rnd" w14:cmpd="sng" w14:algn="ctr">
+            <w14:solidFill>
+              <w14:srgbClr w14:val="92D050"/>
+            </w14:solidFill>
+            <w14:prstDash w14:val="solid"/>
+            <w14:bevel/>
+          </w14:textOutline>
+        </w:rPr>
+        <w:t>ASIGNACIONES DE TECLAS:</w:t>
+      </w:r>
+    </w:p>
+    <w:p>
+      <w:pPr>
+        <w:rPr>
+          <w:rFonts w:ascii="DePixel" w:hAnsi="DePixel"/>
+          <w:b/>
+          <w:bCs/>
+          <w:sz w:val="20"/>
+          <w:szCs w:val="20"/>
+          <w:lang w:val="es-MX"/>
+        </w:rPr>
+      </w:pPr>
+      <w:r>
+        <w:rPr>
+          <w:rFonts w:ascii="DePixel" w:hAnsi="DePixel"/>
+          <w:b/>
+          <w:bCs/>
+          <w:sz w:val="20"/>
+          <w:szCs w:val="20"/>
+          <w:lang w:val="es-MX"/>
+        </w:rPr>
+        <w:t>-</w:t>
+      </w:r>
+      <w:r>
+        <w:rPr>
+          <w:rFonts w:ascii="DePixel" w:hAnsi="DePixel"/>
+          <w:b/>
+          <w:bCs/>
+          <w:sz w:val="20"/>
+          <w:szCs w:val="20"/>
+          <w:lang w:val="es-MX"/>
+        </w:rPr>
+        <w:t>Abrir el inventario: Con la tecla “Q”</w:t>
+      </w:r>
+    </w:p>
+    <w:p>
+      <w:pPr>
+        <w:rPr>
+          <w:rFonts w:ascii="DePixel" w:hAnsi="DePixel"/>
+          <w:b/>
+          <w:bCs/>
+          <w:sz w:val="20"/>
+          <w:szCs w:val="20"/>
+          <w:lang w:val="es-MX"/>
+        </w:rPr>
+      </w:pPr>
+      <w:r>
+        <w:rPr>
+          <w:rFonts w:ascii="DePixel" w:hAnsi="DePixel"/>
+          <w:b/>
+          <w:bCs/>
+          <w:sz w:val="20"/>
+          <w:szCs w:val="20"/>
+          <w:lang w:val="es-MX"/>
+        </w:rPr>
+        <w:t>-Agacharte: Con la tecla “</w:t>
+      </w:r>
+      <w:proofErr w:type="spellStart"/>
+      <w:r>
+        <w:rPr>
+          <w:rFonts w:ascii="DePixel" w:hAnsi="DePixel"/>
+          <w:b/>
+          <w:bCs/>
+          <w:sz w:val="20"/>
+          <w:szCs w:val="20"/>
+          <w:lang w:val="es-MX"/>
+        </w:rPr>
+        <w:t>Ctrl</w:t>
+      </w:r>
+      <w:proofErr w:type="spellEnd"/>
+      <w:r>
+        <w:rPr>
+          <w:rFonts w:ascii="DePixel" w:hAnsi="DePixel"/>
+          <w:b/>
+          <w:bCs/>
+          <w:sz w:val="20"/>
+          <w:szCs w:val="20"/>
+          <w:lang w:val="es-MX"/>
+        </w:rPr>
+        <w:t xml:space="preserve"> Izquierdo”</w:t>
+      </w:r>
+    </w:p>
+    <w:p>
+      <w:pPr>
+        <w:rPr>
+          <w:rFonts w:ascii="DePixel" w:hAnsi="DePixel"/>
+          <w:b/>
+          <w:bCs/>
+          <w:sz w:val="20"/>
+          <w:szCs w:val="20"/>
+          <w:lang w:val="es-MX"/>
+        </w:rPr>
+      </w:pPr>
+    </w:p>
+    <w:p>
+      <w:pPr>
+        <w:rPr>
+          <w:rFonts w:ascii="DePixel" w:hAnsi="DePixel"/>
+          <w:b/>
+          <w:bCs/>
+          <w:sz w:val="20"/>
+          <w:szCs w:val="20"/>
+          <w:lang w:val="es-MX"/>
+        </w:rPr>
+      </w:pPr>
+    </w:p>
+    <w:p>
+      <w:pPr>
+        <w:rPr>
+          <w:rFonts w:ascii="DePixel" w:hAnsi="DePixel"/>
+          <w:b/>
+          <w:bCs/>
+          <w:sz w:val="20"/>
+          <w:szCs w:val="20"/>
+          <w:lang w:val="es-MX"/>
+        </w:rPr>
+      </w:pPr>
+    </w:p>
+    <w:p>
+      <w:pPr>
+        <w:rPr>
+          <w:rFonts w:ascii="DePixel" w:hAnsi="DePixel"/>
+          <w:b/>
+          <w:bCs/>
+          <w:sz w:val="20"/>
+          <w:szCs w:val="20"/>
+          <w:lang w:val="es-MX"/>
+        </w:rPr>
+      </w:pPr>
+    </w:p>
+    <w:p>
+      <w:pPr>
+        <w:rPr>
+          <w:rFonts w:ascii="DePixel" w:hAnsi="DePixel"/>
+          <w:sz w:val="20"/>
+          <w:szCs w:val="20"/>
+          <w:lang w:val="es-MX"/>
+        </w:rPr>
+      </w:pPr>
+    </w:p>
+    <w:p>
+      <w:pPr>
+        <w:rPr>
+          <w:rFonts w:ascii="DePixel" w:hAnsi="DePixel"/>
+          <w:sz w:val="20"/>
+          <w:szCs w:val="20"/>
+          <w:lang w:val="es-MX"/>
+        </w:rPr>
+      </w:pPr>
+      <w:r>
+        <w:rPr>
+          <w:rFonts w:ascii="DePixel" w:eastAsiaTheme="majorEastAsia" w:hAnsi="DePixel" w:cstheme="majorBidi"/>
+          <w:b/>
+          <w:bCs/>
+          <w:noProof/>
+          <w:color w:val="000000" w:themeColor="text1"/>
+          <w:sz w:val="28"/>
+          <w:szCs w:val="28"/>
+          <w:lang w:val="es-MX"/>
+          <w14:textOutline w14:w="9525" w14:cap="rnd" w14:cmpd="sng" w14:algn="ctr">
+            <w14:solidFill>
+              <w14:srgbClr w14:val="92D050"/>
+            </w14:solidFill>
+            <w14:prstDash w14:val="solid"/>
+            <w14:bevel/>
+          </w14:textOutline>
+        </w:rPr>
         <w:drawing>
-          <wp:anchor distT="0" distB="0" distL="114300" distR="114300" simplePos="0" relativeHeight="251657728" behindDoc="1" locked="0" layoutInCell="1" allowOverlap="1" wp14:anchorId="584DBFE6" wp14:editId="16A5AF8C">
+          <wp:anchor distT="0" distB="0" distL="114300" distR="114300" simplePos="0" relativeHeight="251657728" behindDoc="1" locked="0" layoutInCell="1" allowOverlap="1" wp14:anchorId="584DBFE6" wp14:editId="03DC8A56">
             <wp:simplePos x="0" y="0"/>
             <wp:positionH relativeFrom="column">
-              <wp:posOffset>-127000</wp:posOffset>
+              <wp:posOffset>-71120</wp:posOffset>
             </wp:positionH>
             <wp:positionV relativeFrom="paragraph">
-              <wp:posOffset>-254000</wp:posOffset>
+              <wp:posOffset>48895</wp:posOffset>
             </wp:positionV>
             <wp:extent cx="5943600" cy="3343275"/>
             <wp:effectExtent l="0" t="0" r="0" b="9525"/>
@@ -3820,7 +6189,10 @@
           </wp:anchor>
         </w:drawing>
       </w:r>
-      <w:r>
+    </w:p>
+    <w:p>
+      <w:pPr>
+        <w:jc w:val="center"/>
         <w:rPr>
           <w:rFonts w:ascii="DePixel" w:eastAsiaTheme="majorEastAsia" w:hAnsi="DePixel" w:cstheme="majorBidi"/>
           <w:b/>
@@ -3837,15 +6209,15 @@
             <w14:bevel/>
           </w14:textOutline>
         </w:rPr>
-        <w:t xml:space="preserve">Arte Conceptual de la criatura que puede acechar: </w:t>
-      </w:r>
-      <w:r>
-        <w:rPr>
-          <w:rFonts w:ascii="Pixel" w:hAnsi="Pixel"/>
-          <w:noProof/>
+      </w:pPr>
+      <w:r>
+        <w:rPr>
+          <w:rFonts w:ascii="DePixel" w:eastAsiaTheme="majorEastAsia" w:hAnsi="DePixel" w:cstheme="majorBidi"/>
+          <w:b/>
+          <w:bCs/>
           <w:color w:val="000000" w:themeColor="text1"/>
-          <w:sz w:val="96"/>
-          <w:szCs w:val="96"/>
+          <w:sz w:val="28"/>
+          <w:szCs w:val="28"/>
           <w:lang w:val="es-MX"/>
           <w14:textOutline w14:w="9525" w14:cap="rnd" w14:cmpd="sng" w14:algn="ctr">
             <w14:solidFill>
@@ -3855,59 +6227,13 @@
             <w14:bevel/>
           </w14:textOutline>
         </w:rPr>
-        <w:drawing>
-          <wp:anchor distT="0" distB="0" distL="114300" distR="114300" simplePos="0" relativeHeight="251655680" behindDoc="1" locked="0" layoutInCell="1" allowOverlap="1" wp14:anchorId="74E025FE" wp14:editId="0D8FF00D">
-            <wp:simplePos x="0" y="0"/>
-            <wp:positionH relativeFrom="column">
-              <wp:posOffset>-901700</wp:posOffset>
-            </wp:positionH>
-            <wp:positionV relativeFrom="paragraph">
-              <wp:posOffset>-914400</wp:posOffset>
-            </wp:positionV>
-            <wp:extent cx="7747000" cy="10033000"/>
-            <wp:effectExtent l="0" t="0" r="6350" b="6350"/>
-            <wp:wrapNone/>
-            <wp:docPr id="1129867552" name="Imagen 1"/>
-            <wp:cNvGraphicFramePr>
-              <a:graphicFrameLocks xmlns:a="http://schemas.openxmlformats.org/drawingml/2006/main" noChangeAspect="1"/>
-            </wp:cNvGraphicFramePr>
-            <a:graphic xmlns:a="http://schemas.openxmlformats.org/drawingml/2006/main">
-              <a:graphicData uri="http://schemas.openxmlformats.org/drawingml/2006/picture">
-                <pic:pic xmlns:pic="http://schemas.openxmlformats.org/drawingml/2006/picture">
-                  <pic:nvPicPr>
-                    <pic:cNvPr id="442418022" name=""/>
-                    <pic:cNvPicPr/>
-                  </pic:nvPicPr>
-                  <pic:blipFill>
-                    <a:blip r:embed="rId10"/>
-                    <a:stretch>
-                      <a:fillRect/>
-                    </a:stretch>
-                  </pic:blipFill>
-                  <pic:spPr>
-                    <a:xfrm>
-                      <a:off x="0" y="0"/>
-                      <a:ext cx="7747000" cy="10033000"/>
-                    </a:xfrm>
-                    <a:prstGeom prst="rect">
-                      <a:avLst/>
-                    </a:prstGeom>
-                  </pic:spPr>
-                </pic:pic>
-              </a:graphicData>
-            </a:graphic>
-            <wp14:sizeRelH relativeFrom="page">
-              <wp14:pctWidth>0</wp14:pctWidth>
-            </wp14:sizeRelH>
-            <wp14:sizeRelV relativeFrom="page">
-              <wp14:pctHeight>0</wp14:pctHeight>
-            </wp14:sizeRelV>
-          </wp:anchor>
-        </w:drawing>
-      </w:r>
-      <w:r>
-        <w:rPr>
-          <w:rFonts w:ascii="DePixel" w:eastAsiaTheme="majorEastAsia" w:hAnsi="DePixel" w:cs="Times New Roman"/>
+        <w:lastRenderedPageBreak/>
+        <w:t>Arte Conceptual de la criatura que puede acechar</w:t>
+      </w:r>
+      <w:proofErr w:type="gramStart"/>
+      <w:r>
+        <w:rPr>
+          <w:rFonts w:ascii="DePixel" w:eastAsiaTheme="majorEastAsia" w:hAnsi="DePixel" w:cstheme="majorBidi"/>
           <w:b/>
           <w:bCs/>
           <w:color w:val="000000" w:themeColor="text1"/>
@@ -3922,7 +6248,7 @@
             <w14:bevel/>
           </w14:textOutline>
         </w:rPr>
-        <w:t xml:space="preserve"> </w:t>
+        <w:t xml:space="preserve">: </w:t>
       </w:r>
       <w:r>
         <w:rPr>
@@ -3941,11 +6267,11 @@
             <w14:bevel/>
           </w14:textOutline>
         </w:rPr>
-        <w:t>“</w:t>
-      </w:r>
-      <w:r>
-        <w:rPr>
-          <w:rFonts w:ascii="DePixel" w:eastAsiaTheme="majorEastAsia" w:hAnsi="DePixel" w:cstheme="majorBidi"/>
+        <w:t xml:space="preserve"> </w:t>
+      </w:r>
+      <w:r>
+        <w:rPr>
+          <w:rFonts w:ascii="DePixel" w:eastAsiaTheme="majorEastAsia" w:hAnsi="DePixel" w:cs="Times New Roman"/>
           <w:b/>
           <w:bCs/>
           <w:color w:val="000000" w:themeColor="text1"/>
@@ -3960,11 +6286,12 @@
             <w14:bevel/>
           </w14:textOutline>
         </w:rPr>
-        <w:t>V37</w:t>
-      </w:r>
-      <w:r>
-        <w:rPr>
-          <w:rFonts w:ascii="DePixel" w:eastAsiaTheme="majorEastAsia" w:hAnsi="DePixel" w:cs="Times New Roman"/>
+        <w:t>“</w:t>
+      </w:r>
+      <w:proofErr w:type="gramEnd"/>
+      <w:r>
+        <w:rPr>
+          <w:rFonts w:ascii="DePixel" w:eastAsiaTheme="majorEastAsia" w:hAnsi="DePixel" w:cstheme="majorBidi"/>
           <w:b/>
           <w:bCs/>
           <w:color w:val="000000" w:themeColor="text1"/>
@@ -3979,6 +6306,25 @@
             <w14:bevel/>
           </w14:textOutline>
         </w:rPr>
+        <w:t>V37</w:t>
+      </w:r>
+      <w:r>
+        <w:rPr>
+          <w:rFonts w:ascii="DePixel" w:eastAsiaTheme="majorEastAsia" w:hAnsi="DePixel" w:cs="Times New Roman"/>
+          <w:b/>
+          <w:bCs/>
+          <w:color w:val="000000" w:themeColor="text1"/>
+          <w:sz w:val="28"/>
+          <w:szCs w:val="28"/>
+          <w:lang w:val="es-MX"/>
+          <w14:textOutline w14:w="9525" w14:cap="rnd" w14:cmpd="sng" w14:algn="ctr">
+            <w14:solidFill>
+              <w14:srgbClr w14:val="92D050"/>
+            </w14:solidFill>
+            <w14:prstDash w14:val="solid"/>
+            <w14:bevel/>
+          </w14:textOutline>
+        </w:rPr>
         <w:t>”</w:t>
       </w:r>
     </w:p>
@@ -4017,7 +6363,27 @@
           <w:szCs w:val="20"/>
           <w:lang w:val="es-MX"/>
         </w:rPr>
-        <w:t xml:space="preserve">Tras el desastre V37 entreno su capacidad de audio que puede recordar canciones, entonces le gusto tanto la música, que cuando acecha sus presas reproduce música de piano, cuando se alerta aumenta las notas y el sonido y es mas acelerado, cuando ve por fin a sus presas su música se vuelve tan violenta que te dan ganas de bailar. </w:t>
+        <w:t xml:space="preserve">Tras el desastre V37 entreno su capacidad de audio que puede recordar canciones, entonces le gusto tanto la música, que cuando acecha sus presas reproduce música de piano, cuando se alerta aumenta las notas y el sonido y es </w:t>
+      </w:r>
+      <w:proofErr w:type="spellStart"/>
+      <w:r>
+        <w:rPr>
+          <w:rFonts w:ascii="DePixel" w:hAnsi="DePixel"/>
+          <w:sz w:val="20"/>
+          <w:szCs w:val="20"/>
+          <w:lang w:val="es-MX"/>
+        </w:rPr>
+        <w:t>mas</w:t>
+      </w:r>
+      <w:proofErr w:type="spellEnd"/>
+      <w:r>
+        <w:rPr>
+          <w:rFonts w:ascii="DePixel" w:hAnsi="DePixel"/>
+          <w:sz w:val="20"/>
+          <w:szCs w:val="20"/>
+          <w:lang w:val="es-MX"/>
+        </w:rPr>
+        <w:t xml:space="preserve"> acelerado, cuando ve por fin a sus presas su música se vuelve tan violenta que te dan ganas de bailar. </w:t>
       </w:r>
     </w:p>
     <w:sectPr>

</xml_diff>